<commit_message>
SG4 innovation artefacts + test plan (#100)
</commit_message>
<xml_diff>
--- a/SG4_Innovation/SG4_Artefacts/SG4_Design.docx
+++ b/SG4_Innovation/SG4_Artefacts/SG4_Design.docx
@@ -1099,6 +1099,14 @@
             </w:pPr>
             <w:r>
               <w:rPr>
+                <w:sz w:val="20"/>
+                <w:szCs w:val="20"/>
+                <w:rtl w:val="0"/>
+              </w:rPr>
+              <w:t xml:space="preserve">2026-02-28</w:t>
+            </w:r>
+            <w:r>
+              <w:rPr>
                 <w:rtl w:val="0"/>
               </w:rPr>
             </w:r>
@@ -1142,6 +1150,14 @@
             </w:pPr>
             <w:r>
               <w:rPr>
+                <w:sz w:val="20"/>
+                <w:szCs w:val="20"/>
+                <w:rtl w:val="0"/>
+              </w:rPr>
+              <w:t xml:space="preserve">1.0</w:t>
+            </w:r>
+            <w:r>
+              <w:rPr>
                 <w:rtl w:val="0"/>
               </w:rPr>
             </w:r>
@@ -1185,6 +1201,14 @@
             </w:pPr>
             <w:r>
               <w:rPr>
+                <w:sz w:val="20"/>
+                <w:szCs w:val="20"/>
+                <w:rtl w:val="0"/>
+              </w:rPr>
+              <w:t xml:space="preserve">Speech Recognition Initial Design D5</w:t>
+            </w:r>
+            <w:r>
+              <w:rPr>
                 <w:rtl w:val="0"/>
               </w:rPr>
             </w:r>
@@ -1228,8 +1252,497 @@
             </w:pPr>
             <w:r>
               <w:rPr>
-                <w:rtl w:val="0"/>
-              </w:rPr>
+                <w:sz w:val="20"/>
+                <w:szCs w:val="20"/>
+                <w:rtl w:val="0"/>
+              </w:rPr>
+              <w:t xml:space="preserve">Daniel Holderik</w:t>
+            </w:r>
+            <w:r>
+              <w:rPr>
+                <w:rtl w:val="0"/>
+              </w:rPr>
+            </w:r>
+          </w:p>
+        </w:tc>
+      </w:tr>
+      <w:tr>
+        <w:trPr>
+          <w:cantSplit w:val="0"/>
+          <w:tblHeader w:val="0"/>
+        </w:trPr>
+        <w:tc>
+          <w:tcPr>
+            <w:vAlign w:val="top"/>
+          </w:tcPr>
+          <w:p>
+            <w:pPr>
+              <w:keepNext w:val="0"/>
+              <w:keepLines w:val="1"/>
+              <w:pageBreakBefore w:val="0"/>
+              <w:widowControl w:val="0"/>
+              <w:pBdr>
+                <w:top w:space="0" w:sz="0" w:val="nil"/>
+                <w:left w:space="0" w:sz="0" w:val="nil"/>
+                <w:bottom w:space="0" w:sz="0" w:val="nil"/>
+                <w:right w:space="0" w:sz="0" w:val="nil"/>
+                <w:between w:space="0" w:sz="0" w:val="nil"/>
+              </w:pBdr>
+              <w:shd w:fill="auto" w:val="clear"/>
+              <w:spacing w:after="120" w:before="0" w:line="240" w:lineRule="auto"/>
+              <w:ind w:left="0" w:right="0" w:firstLine="0"/>
+              <w:jc w:val="left"/>
+              <w:rPr>
+                <w:sz w:val="20"/>
+                <w:szCs w:val="20"/>
+              </w:rPr>
+            </w:pPr>
+            <w:r>
+              <w:rPr>
+                <w:sz w:val="20"/>
+                <w:szCs w:val="20"/>
+                <w:rtl w:val="0"/>
+              </w:rPr>
+              <w:t xml:space="preserve">2026-03-15</w:t>
+            </w:r>
+          </w:p>
+        </w:tc>
+        <w:tc>
+          <w:tcPr>
+            <w:vAlign w:val="top"/>
+          </w:tcPr>
+          <w:p>
+            <w:pPr>
+              <w:keepNext w:val="0"/>
+              <w:keepLines w:val="1"/>
+              <w:pageBreakBefore w:val="0"/>
+              <w:widowControl w:val="0"/>
+              <w:pBdr>
+                <w:top w:space="0" w:sz="0" w:val="nil"/>
+                <w:left w:space="0" w:sz="0" w:val="nil"/>
+                <w:bottom w:space="0" w:sz="0" w:val="nil"/>
+                <w:right w:space="0" w:sz="0" w:val="nil"/>
+                <w:between w:space="0" w:sz="0" w:val="nil"/>
+              </w:pBdr>
+              <w:shd w:fill="auto" w:val="clear"/>
+              <w:spacing w:after="120" w:before="0" w:line="240" w:lineRule="auto"/>
+              <w:ind w:left="0" w:right="0" w:firstLine="0"/>
+              <w:jc w:val="left"/>
+              <w:rPr>
+                <w:sz w:val="20"/>
+                <w:szCs w:val="20"/>
+              </w:rPr>
+            </w:pPr>
+            <w:r>
+              <w:rPr>
+                <w:sz w:val="20"/>
+                <w:szCs w:val="20"/>
+                <w:rtl w:val="0"/>
+              </w:rPr>
+              <w:t xml:space="preserve">1,0</w:t>
+            </w:r>
+          </w:p>
+        </w:tc>
+        <w:tc>
+          <w:tcPr>
+            <w:vAlign w:val="top"/>
+          </w:tcPr>
+          <w:p>
+            <w:pPr>
+              <w:keepNext w:val="0"/>
+              <w:keepLines w:val="1"/>
+              <w:pageBreakBefore w:val="0"/>
+              <w:widowControl w:val="0"/>
+              <w:pBdr>
+                <w:top w:space="0" w:sz="0" w:val="nil"/>
+                <w:left w:space="0" w:sz="0" w:val="nil"/>
+                <w:bottom w:space="0" w:sz="0" w:val="nil"/>
+                <w:right w:space="0" w:sz="0" w:val="nil"/>
+                <w:between w:space="0" w:sz="0" w:val="nil"/>
+              </w:pBdr>
+              <w:shd w:fill="auto" w:val="clear"/>
+              <w:spacing w:after="120" w:before="0" w:line="240" w:lineRule="auto"/>
+              <w:ind w:left="0" w:right="0" w:firstLine="0"/>
+              <w:jc w:val="left"/>
+              <w:rPr>
+                <w:sz w:val="20"/>
+                <w:szCs w:val="20"/>
+              </w:rPr>
+            </w:pPr>
+            <w:r>
+              <w:rPr>
+                <w:sz w:val="20"/>
+                <w:szCs w:val="20"/>
+                <w:rtl w:val="0"/>
+              </w:rPr>
+              <w:t xml:space="preserve">Floating Speech control and revission</w:t>
+            </w:r>
+          </w:p>
+        </w:tc>
+        <w:tc>
+          <w:tcPr>
+            <w:vAlign w:val="top"/>
+          </w:tcPr>
+          <w:p>
+            <w:pPr>
+              <w:keepNext w:val="0"/>
+              <w:keepLines w:val="1"/>
+              <w:pageBreakBefore w:val="0"/>
+              <w:widowControl w:val="0"/>
+              <w:pBdr>
+                <w:top w:space="0" w:sz="0" w:val="nil"/>
+                <w:left w:space="0" w:sz="0" w:val="nil"/>
+                <w:bottom w:space="0" w:sz="0" w:val="nil"/>
+                <w:right w:space="0" w:sz="0" w:val="nil"/>
+                <w:between w:space="0" w:sz="0" w:val="nil"/>
+              </w:pBdr>
+              <w:shd w:fill="auto" w:val="clear"/>
+              <w:spacing w:after="120" w:before="0" w:line="240" w:lineRule="auto"/>
+              <w:ind w:left="0" w:right="0" w:firstLine="0"/>
+              <w:jc w:val="left"/>
+              <w:rPr>
+                <w:sz w:val="20"/>
+                <w:szCs w:val="20"/>
+              </w:rPr>
+            </w:pPr>
+            <w:r>
+              <w:rPr>
+                <w:sz w:val="20"/>
+                <w:szCs w:val="20"/>
+                <w:rtl w:val="0"/>
+              </w:rPr>
+              <w:t xml:space="preserve">Daniel Holderik</w:t>
+            </w:r>
+          </w:p>
+        </w:tc>
+      </w:tr>
+      <w:tr>
+        <w:trPr>
+          <w:cantSplit w:val="0"/>
+          <w:tblHeader w:val="0"/>
+        </w:trPr>
+        <w:tc>
+          <w:tcPr>
+            <w:vAlign w:val="top"/>
+          </w:tcPr>
+          <w:p>
+            <w:pPr>
+              <w:keepNext w:val="0"/>
+              <w:keepLines w:val="1"/>
+              <w:pageBreakBefore w:val="0"/>
+              <w:widowControl w:val="0"/>
+              <w:pBdr>
+                <w:top w:space="0" w:sz="0" w:val="nil"/>
+                <w:left w:space="0" w:sz="0" w:val="nil"/>
+                <w:bottom w:space="0" w:sz="0" w:val="nil"/>
+                <w:right w:space="0" w:sz="0" w:val="nil"/>
+                <w:between w:space="0" w:sz="0" w:val="nil"/>
+              </w:pBdr>
+              <w:shd w:fill="auto" w:val="clear"/>
+              <w:spacing w:after="120" w:before="0" w:line="240" w:lineRule="auto"/>
+              <w:ind w:left="0" w:right="0" w:firstLine="0"/>
+              <w:jc w:val="left"/>
+              <w:rPr>
+                <w:sz w:val="20"/>
+                <w:szCs w:val="20"/>
+              </w:rPr>
+            </w:pPr>
+            <w:r>
+              <w:rPr>
+                <w:sz w:val="20"/>
+                <w:szCs w:val="20"/>
+                <w:rtl w:val="0"/>
+              </w:rPr>
+              <w:t xml:space="preserve">2026 -03-16</w:t>
+            </w:r>
+          </w:p>
+        </w:tc>
+        <w:tc>
+          <w:tcPr>
+            <w:vAlign w:val="top"/>
+          </w:tcPr>
+          <w:p>
+            <w:pPr>
+              <w:keepNext w:val="0"/>
+              <w:keepLines w:val="1"/>
+              <w:pageBreakBefore w:val="0"/>
+              <w:widowControl w:val="0"/>
+              <w:pBdr>
+                <w:top w:space="0" w:sz="0" w:val="nil"/>
+                <w:left w:space="0" w:sz="0" w:val="nil"/>
+                <w:bottom w:space="0" w:sz="0" w:val="nil"/>
+                <w:right w:space="0" w:sz="0" w:val="nil"/>
+                <w:between w:space="0" w:sz="0" w:val="nil"/>
+              </w:pBdr>
+              <w:shd w:fill="auto" w:val="clear"/>
+              <w:spacing w:after="120" w:before="0" w:line="240" w:lineRule="auto"/>
+              <w:ind w:left="0" w:right="0" w:firstLine="0"/>
+              <w:jc w:val="left"/>
+              <w:rPr>
+                <w:sz w:val="20"/>
+                <w:szCs w:val="20"/>
+              </w:rPr>
+            </w:pPr>
+            <w:r>
+              <w:rPr>
+                <w:sz w:val="20"/>
+                <w:szCs w:val="20"/>
+                <w:rtl w:val="0"/>
+              </w:rPr>
+              <w:t xml:space="preserve">1.1</w:t>
+            </w:r>
+          </w:p>
+        </w:tc>
+        <w:tc>
+          <w:tcPr>
+            <w:vAlign w:val="top"/>
+          </w:tcPr>
+          <w:p>
+            <w:pPr>
+              <w:keepNext w:val="0"/>
+              <w:keepLines w:val="1"/>
+              <w:pageBreakBefore w:val="0"/>
+              <w:widowControl w:val="0"/>
+              <w:pBdr>
+                <w:top w:space="0" w:sz="0" w:val="nil"/>
+                <w:left w:space="0" w:sz="0" w:val="nil"/>
+                <w:bottom w:space="0" w:sz="0" w:val="nil"/>
+                <w:right w:space="0" w:sz="0" w:val="nil"/>
+                <w:between w:space="0" w:sz="0" w:val="nil"/>
+              </w:pBdr>
+              <w:shd w:fill="auto" w:val="clear"/>
+              <w:spacing w:after="120" w:before="0" w:line="240" w:lineRule="auto"/>
+              <w:ind w:left="0" w:right="0" w:firstLine="0"/>
+              <w:jc w:val="left"/>
+              <w:rPr>
+                <w:sz w:val="20"/>
+                <w:szCs w:val="20"/>
+              </w:rPr>
+            </w:pPr>
+            <w:r>
+              <w:rPr>
+                <w:sz w:val="20"/>
+                <w:szCs w:val="20"/>
+                <w:rtl w:val="0"/>
+              </w:rPr>
+              <w:t xml:space="preserve">Modify D1-D4 for Web</w:t>
+            </w:r>
+          </w:p>
+        </w:tc>
+        <w:tc>
+          <w:tcPr>
+            <w:vAlign w:val="top"/>
+          </w:tcPr>
+          <w:p>
+            <w:pPr>
+              <w:keepNext w:val="0"/>
+              <w:keepLines w:val="1"/>
+              <w:pageBreakBefore w:val="0"/>
+              <w:widowControl w:val="0"/>
+              <w:pBdr>
+                <w:top w:space="0" w:sz="0" w:val="nil"/>
+                <w:left w:space="0" w:sz="0" w:val="nil"/>
+                <w:bottom w:space="0" w:sz="0" w:val="nil"/>
+                <w:right w:space="0" w:sz="0" w:val="nil"/>
+                <w:between w:space="0" w:sz="0" w:val="nil"/>
+              </w:pBdr>
+              <w:shd w:fill="auto" w:val="clear"/>
+              <w:spacing w:after="120" w:before="0" w:line="240" w:lineRule="auto"/>
+              <w:ind w:left="0" w:right="0" w:firstLine="0"/>
+              <w:jc w:val="left"/>
+              <w:rPr>
+                <w:sz w:val="20"/>
+                <w:szCs w:val="20"/>
+              </w:rPr>
+            </w:pPr>
+            <w:r>
+              <w:rPr>
+                <w:sz w:val="20"/>
+                <w:szCs w:val="20"/>
+                <w:rtl w:val="0"/>
+              </w:rPr>
+              <w:t xml:space="preserve">Anitta Antony</w:t>
+            </w:r>
+          </w:p>
+          <w:p>
+            <w:pPr>
+              <w:keepNext w:val="0"/>
+              <w:keepLines w:val="1"/>
+              <w:pageBreakBefore w:val="0"/>
+              <w:widowControl w:val="0"/>
+              <w:pBdr>
+                <w:top w:space="0" w:sz="0" w:val="nil"/>
+                <w:left w:space="0" w:sz="0" w:val="nil"/>
+                <w:bottom w:space="0" w:sz="0" w:val="nil"/>
+                <w:right w:space="0" w:sz="0" w:val="nil"/>
+                <w:between w:space="0" w:sz="0" w:val="nil"/>
+              </w:pBdr>
+              <w:shd w:fill="auto" w:val="clear"/>
+              <w:spacing w:after="120" w:before="0" w:line="240" w:lineRule="auto"/>
+              <w:ind w:left="0" w:right="0" w:firstLine="0"/>
+              <w:jc w:val="left"/>
+              <w:rPr>
+                <w:sz w:val="20"/>
+                <w:szCs w:val="20"/>
+              </w:rPr>
+            </w:pPr>
+            <w:r>
+              <w:rPr>
+                <w:sz w:val="20"/>
+                <w:szCs w:val="20"/>
+                <w:rtl w:val="0"/>
+              </w:rPr>
+              <w:t xml:space="preserve">Md Abu Taher</w:t>
+            </w:r>
+          </w:p>
+        </w:tc>
+      </w:tr>
+      <w:tr>
+        <w:trPr>
+          <w:cantSplit w:val="0"/>
+          <w:tblHeader w:val="0"/>
+        </w:trPr>
+        <w:tc>
+          <w:tcPr>
+            <w:vAlign w:val="top"/>
+          </w:tcPr>
+          <w:p>
+            <w:pPr>
+              <w:keepNext w:val="0"/>
+              <w:keepLines w:val="1"/>
+              <w:pageBreakBefore w:val="0"/>
+              <w:widowControl w:val="0"/>
+              <w:pBdr>
+                <w:top w:space="0" w:sz="0" w:val="nil"/>
+                <w:left w:space="0" w:sz="0" w:val="nil"/>
+                <w:bottom w:space="0" w:sz="0" w:val="nil"/>
+                <w:right w:space="0" w:sz="0" w:val="nil"/>
+                <w:between w:space="0" w:sz="0" w:val="nil"/>
+              </w:pBdr>
+              <w:shd w:fill="auto" w:val="clear"/>
+              <w:spacing w:after="120" w:before="0" w:line="240" w:lineRule="auto"/>
+              <w:ind w:left="0" w:right="0" w:firstLine="0"/>
+              <w:jc w:val="left"/>
+              <w:rPr>
+                <w:sz w:val="20"/>
+                <w:szCs w:val="20"/>
+              </w:rPr>
+            </w:pPr>
+            <w:r>
+              <w:rPr>
+                <w:sz w:val="20"/>
+                <w:szCs w:val="20"/>
+                <w:rtl w:val="0"/>
+              </w:rPr>
+              <w:t xml:space="preserve">2026-03-16</w:t>
+            </w:r>
+          </w:p>
+        </w:tc>
+        <w:tc>
+          <w:tcPr>
+            <w:vAlign w:val="top"/>
+          </w:tcPr>
+          <w:p>
+            <w:pPr>
+              <w:keepNext w:val="0"/>
+              <w:keepLines w:val="1"/>
+              <w:pageBreakBefore w:val="0"/>
+              <w:widowControl w:val="0"/>
+              <w:pBdr>
+                <w:top w:space="0" w:sz="0" w:val="nil"/>
+                <w:left w:space="0" w:sz="0" w:val="nil"/>
+                <w:bottom w:space="0" w:sz="0" w:val="nil"/>
+                <w:right w:space="0" w:sz="0" w:val="nil"/>
+                <w:between w:space="0" w:sz="0" w:val="nil"/>
+              </w:pBdr>
+              <w:shd w:fill="auto" w:val="clear"/>
+              <w:spacing w:after="120" w:before="0" w:line="240" w:lineRule="auto"/>
+              <w:ind w:left="0" w:right="0" w:firstLine="0"/>
+              <w:jc w:val="left"/>
+              <w:rPr>
+                <w:sz w:val="20"/>
+                <w:szCs w:val="20"/>
+              </w:rPr>
+            </w:pPr>
+            <w:r>
+              <w:rPr>
+                <w:sz w:val="20"/>
+                <w:szCs w:val="20"/>
+                <w:rtl w:val="0"/>
+              </w:rPr>
+              <w:t xml:space="preserve">1.1</w:t>
+            </w:r>
+          </w:p>
+        </w:tc>
+        <w:tc>
+          <w:tcPr>
+            <w:vAlign w:val="top"/>
+          </w:tcPr>
+          <w:p>
+            <w:pPr>
+              <w:keepNext w:val="0"/>
+              <w:keepLines w:val="1"/>
+              <w:pageBreakBefore w:val="0"/>
+              <w:widowControl w:val="0"/>
+              <w:pBdr>
+                <w:top w:space="0" w:sz="0" w:val="nil"/>
+                <w:left w:space="0" w:sz="0" w:val="nil"/>
+                <w:bottom w:space="0" w:sz="0" w:val="nil"/>
+                <w:right w:space="0" w:sz="0" w:val="nil"/>
+                <w:between w:space="0" w:sz="0" w:val="nil"/>
+              </w:pBdr>
+              <w:shd w:fill="auto" w:val="clear"/>
+              <w:spacing w:after="120" w:before="0" w:line="240" w:lineRule="auto"/>
+              <w:ind w:left="0" w:right="0" w:firstLine="0"/>
+              <w:jc w:val="left"/>
+              <w:rPr>
+                <w:sz w:val="20"/>
+                <w:szCs w:val="20"/>
+              </w:rPr>
+            </w:pPr>
+            <w:r>
+              <w:rPr>
+                <w:sz w:val="20"/>
+                <w:szCs w:val="20"/>
+                <w:rtl w:val="0"/>
+              </w:rPr>
+              <w:t xml:space="preserve">Testing</w:t>
+            </w:r>
+          </w:p>
+        </w:tc>
+        <w:tc>
+          <w:tcPr>
+            <w:vAlign w:val="top"/>
+          </w:tcPr>
+          <w:p>
+            <w:pPr>
+              <w:keepNext w:val="0"/>
+              <w:keepLines w:val="1"/>
+              <w:pageBreakBefore w:val="0"/>
+              <w:widowControl w:val="0"/>
+              <w:pBdr>
+                <w:top w:space="0" w:sz="0" w:val="nil"/>
+                <w:left w:space="0" w:sz="0" w:val="nil"/>
+                <w:bottom w:space="0" w:sz="0" w:val="nil"/>
+                <w:right w:space="0" w:sz="0" w:val="nil"/>
+                <w:between w:space="0" w:sz="0" w:val="nil"/>
+              </w:pBdr>
+              <w:shd w:fill="auto" w:val="clear"/>
+              <w:spacing w:after="120" w:before="0" w:line="240" w:lineRule="auto"/>
+              <w:ind w:left="0" w:right="0" w:firstLine="0"/>
+              <w:jc w:val="left"/>
+              <w:rPr>
+                <w:sz w:val="20"/>
+                <w:szCs w:val="20"/>
+              </w:rPr>
+            </w:pPr>
+            <w:r>
+              <w:rPr>
+                <w:sz w:val="20"/>
+                <w:szCs w:val="20"/>
+                <w:rtl w:val="0"/>
+              </w:rPr>
+              <w:t xml:space="preserve">Daniel Marcarini</w:t>
             </w:r>
           </w:p>
         </w:tc>
@@ -1590,7 +2103,7 @@
               <w:rPr>
                 <w:rtl w:val="0"/>
               </w:rPr>
-              <w:t xml:space="preserve">SIntent Output Format + Prompting Rules(Gemini)</w:t>
+              <w:t xml:space="preserve">Intent Output Format + Prompting Rules(Firebase AI)</w:t>
             </w:r>
             <w:r>
               <w:rPr>
@@ -1685,13 +2198,13 @@
                 <w:vertAlign w:val="baseline"/>
                 <w:rtl w:val="0"/>
               </w:rPr>
-              <w:t xml:space="preserve">D3.  M</w:t>
-            </w:r>
-            <w:r>
-              <w:rPr>
-                <w:rtl w:val="0"/>
-              </w:rPr>
-              <w:t xml:space="preserve">obile AI Chat UI Design (AiScreen.tsx) + API Contract</w:t>
+              <w:t xml:space="preserve">D3.  </w:t>
+            </w:r>
+            <w:r>
+              <w:rPr>
+                <w:rtl w:val="0"/>
+              </w:rPr>
+              <w:t xml:space="preserve">AI chat UI Design (Mobile+Web) + API Contract</w:t>
             </w:r>
             <w:r>
               <w:rPr>
@@ -1835,6 +2348,129 @@
           </w:p>
         </w:tc>
       </w:tr>
+      <w:tr>
+        <w:trPr>
+          <w:cantSplit w:val="0"/>
+          <w:trHeight w:val="546" w:hRule="atLeast"/>
+          <w:tblHeader w:val="0"/>
+        </w:trPr>
+        <w:tc>
+          <w:tcPr>
+            <w:vAlign w:val="top"/>
+          </w:tcPr>
+          <w:p>
+            <w:pPr>
+              <w:spacing w:after="120" w:before="120" w:lineRule="auto"/>
+              <w:rPr/>
+            </w:pPr>
+            <w:r>
+              <w:rPr>
+                <w:rtl w:val="0"/>
+              </w:rPr>
+              <w:t xml:space="preserve">D5.</w:t>
+            </w:r>
+            <w:r>
+              <w:rPr>
+                <w:sz w:val="16"/>
+                <w:szCs w:val="16"/>
+                <w:rtl w:val="0"/>
+              </w:rPr>
+              <w:t xml:space="preserve"> </w:t>
+            </w:r>
+            <w:r>
+              <w:rPr>
+                <w:rtl w:val="0"/>
+              </w:rPr>
+              <w:t xml:space="preserve">Speech Recognition Integration and Voice Navigation Design</w:t>
+            </w:r>
+            <w:r>
+              <w:rPr>
+                <w:rtl w:val="0"/>
+              </w:rPr>
+            </w:r>
+          </w:p>
+        </w:tc>
+        <w:tc>
+          <w:tcPr>
+            <w:vAlign w:val="top"/>
+          </w:tcPr>
+          <w:p>
+            <w:pPr>
+              <w:widowControl w:val="0"/>
+              <w:tabs>
+                <w:tab w:val="center" w:leader="none" w:pos="4320"/>
+                <w:tab w:val="right" w:leader="none" w:pos="8640"/>
+              </w:tabs>
+              <w:spacing w:after="120" w:before="120" w:lineRule="auto"/>
+              <w:jc w:val="center"/>
+              <w:rPr>
+                <w:sz w:val="20"/>
+                <w:szCs w:val="20"/>
+              </w:rPr>
+            </w:pPr>
+            <w:r>
+              <w:rPr>
+                <w:sz w:val="20"/>
+                <w:szCs w:val="20"/>
+                <w:rtl w:val="0"/>
+              </w:rPr>
+              <w:t xml:space="preserve">Essential</w:t>
+            </w:r>
+          </w:p>
+        </w:tc>
+      </w:tr>
+      <w:tr>
+        <w:trPr>
+          <w:cantSplit w:val="0"/>
+          <w:trHeight w:val="546" w:hRule="atLeast"/>
+          <w:tblHeader w:val="0"/>
+        </w:trPr>
+        <w:tc>
+          <w:tcPr>
+            <w:vAlign w:val="top"/>
+          </w:tcPr>
+          <w:p>
+            <w:pPr>
+              <w:spacing w:after="120" w:before="120" w:lineRule="auto"/>
+              <w:rPr/>
+            </w:pPr>
+            <w:r>
+              <w:rPr>
+                <w:rtl w:val="0"/>
+              </w:rPr>
+              <w:t xml:space="preserve">D6. Web application testing strategy for device-control integration</w:t>
+            </w:r>
+          </w:p>
+        </w:tc>
+        <w:tc>
+          <w:tcPr>
+            <w:vAlign w:val="top"/>
+          </w:tcPr>
+          <w:p>
+            <w:pPr>
+              <w:widowControl w:val="0"/>
+              <w:tabs>
+                <w:tab w:val="center" w:leader="none" w:pos="4320"/>
+                <w:tab w:val="right" w:leader="none" w:pos="8640"/>
+              </w:tabs>
+              <w:spacing w:after="120" w:before="120" w:lineRule="auto"/>
+              <w:jc w:val="center"/>
+              <w:rPr>
+                <w:sz w:val="20"/>
+                <w:szCs w:val="20"/>
+              </w:rPr>
+            </w:pPr>
+            <w:r>
+              <w:rPr>
+                <w:sz w:val="20"/>
+                <w:szCs w:val="20"/>
+                <w:rtl w:val="0"/>
+              </w:rPr>
+              <w:t xml:space="preserve">Desirable</w:t>
+            </w:r>
+          </w:p>
+        </w:tc>
+      </w:tr>
     </w:tbl>
     <w:p>
       <w:pPr>
@@ -2001,149 +2637,96 @@
         <w:rPr>
           <w:rtl w:val="0"/>
         </w:rPr>
-        <w:t xml:space="preserve">This design item defines the overall architecture of the AI feature and how it integrates into the Interactive House project. The AI feature follows a client–server pattern:</w:t>
-      </w:r>
-    </w:p>
-    <w:p>
-      <w:pPr>
-        <w:numPr>
-          <w:ilvl w:val="0"/>
-          <w:numId w:val="9"/>
-        </w:numPr>
-        <w:spacing w:after="0" w:before="0" w:lineRule="auto"/>
-        <w:ind w:left="720" w:hanging="360"/>
-        <w:rPr/>
-      </w:pPr>
-      <w:r>
-        <w:rPr>
+        <w:t xml:space="preserve">The AI feature is implemented for both web (</w:t>
+      </w:r>
+      <w:hyperlink r:id="rId6">
+        <w:r>
+          <w:rPr>
+            <w:color w:val="1155cc"/>
+            <w:u w:val="single"/>
+            <w:rtl w:val="0"/>
+          </w:rPr>
+          <w:t xml:space="preserve">Next.js</w:t>
+        </w:r>
+      </w:hyperlink>
+      <w:r>
+        <w:rPr>
+          <w:rtl w:val="0"/>
+        </w:rPr>
+        <w:t xml:space="preserve">) and mobile (React Native) using a shared Firebase configuration.</w:t>
+      </w:r>
+    </w:p>
+    <w:p>
+      <w:pPr>
+        <w:spacing w:after="240" w:before="0" w:lineRule="auto"/>
+        <w:rPr/>
+      </w:pPr>
+      <w:r>
+        <w:rPr>
+          <w:rtl w:val="0"/>
+        </w:rPr>
+        <w:t xml:space="preserve">User messages are sent from the chat interface to Firebase AI, which generates responses and returns them to the UI.</w:t>
+      </w:r>
+    </w:p>
+    <w:p>
+      <w:pPr>
+        <w:spacing w:after="240" w:before="0" w:lineRule="auto"/>
+        <w:rPr/>
+      </w:pPr>
+      <w:r>
+        <w:rPr>
+          <w:rtl w:val="0"/>
+        </w:rPr>
+        <w:t xml:space="preserve">The web client sends messages using direct AI requests, while the mobile client maintains a chat session for continuous conversation.</w:t>
+      </w:r>
+    </w:p>
+    <w:p>
+      <w:pPr>
+        <w:spacing w:after="240" w:before="0" w:lineRule="auto"/>
+        <w:rPr/>
+      </w:pPr>
+      <w:r>
+        <w:rPr>
+          <w:rtl w:val="0"/>
+        </w:rPr>
+        <w:t xml:space="preserve">The UI displays the response and keeps chat history visible.</w:t>
+      </w:r>
+    </w:p>
+    <w:p>
+      <w:pPr>
+        <w:spacing w:after="240" w:before="0" w:lineRule="auto"/>
+        <w:rPr>
+          <w:rFonts w:ascii="Arial" w:cs="Arial" w:eastAsia="Arial" w:hAnsi="Arial"/>
           <w:b w:val="1"/>
           <w:bCs w:val="1"/>
-          <w:rtl w:val="0"/>
-        </w:rPr>
-        <w:t xml:space="preserve">Mobile App (React Native)</w:t>
-      </w:r>
-      <w:r>
-        <w:rPr>
-          <w:rtl w:val="0"/>
-        </w:rPr>
-        <w:t xml:space="preserve"> collects the user’s natural language message.</w:t>
-      </w:r>
-    </w:p>
-    <w:p>
-      <w:pPr>
-        <w:numPr>
-          <w:ilvl w:val="0"/>
-          <w:numId w:val="9"/>
-        </w:numPr>
-        <w:spacing w:after="0" w:before="0" w:lineRule="auto"/>
-        <w:ind w:left="720" w:hanging="360"/>
-        <w:rPr/>
-      </w:pPr>
-      <w:r>
-        <w:rPr>
-          <w:b w:val="1"/>
-          <w:bCs w:val="1"/>
-          <w:rtl w:val="0"/>
-        </w:rPr>
-        <w:t xml:space="preserve">AI Backend (Node.js/Express)</w:t>
-      </w:r>
-      <w:r>
-        <w:rPr>
-          <w:rtl w:val="0"/>
-        </w:rPr>
-        <w:t xml:space="preserve"> acts as a secure gateway to the AI model.</w:t>
-      </w:r>
-    </w:p>
-    <w:p>
-      <w:pPr>
-        <w:numPr>
-          <w:ilvl w:val="0"/>
-          <w:numId w:val="9"/>
-        </w:numPr>
-        <w:spacing w:after="0" w:before="0" w:lineRule="auto"/>
-        <w:ind w:left="720" w:hanging="360"/>
-        <w:rPr/>
-      </w:pPr>
-      <w:r>
-        <w:rPr>
-          <w:b w:val="1"/>
-          <w:bCs w:val="1"/>
-          <w:rtl w:val="0"/>
-        </w:rPr>
-        <w:t xml:space="preserve">Gemini API</w:t>
-      </w:r>
-      <w:r>
-        <w:rPr>
-          <w:rtl w:val="0"/>
-        </w:rPr>
-        <w:t xml:space="preserve"> interprets the message and outputs a structured result.</w:t>
-      </w:r>
-    </w:p>
-    <w:p>
-      <w:pPr>
-        <w:numPr>
-          <w:ilvl w:val="0"/>
-          <w:numId w:val="9"/>
-        </w:numPr>
-        <w:spacing w:after="0" w:before="0" w:lineRule="auto"/>
-        <w:ind w:left="720" w:hanging="360"/>
-        <w:rPr/>
-      </w:pPr>
-      <w:r>
-        <w:rPr>
-          <w:b w:val="1"/>
-          <w:bCs w:val="1"/>
-          <w:rtl w:val="0"/>
-        </w:rPr>
-        <w:t xml:space="preserve">Router/Controller Layer</w:t>
-      </w:r>
-      <w:r>
-        <w:rPr>
-          <w:rtl w:val="0"/>
-        </w:rPr>
-        <w:t xml:space="preserve"> executes the action (door, ventilation, alarms, sensors).</w:t>
-      </w:r>
-    </w:p>
-    <w:p>
-      <w:pPr>
-        <w:numPr>
-          <w:ilvl w:val="0"/>
-          <w:numId w:val="9"/>
-        </w:numPr>
-        <w:spacing w:after="240" w:before="0" w:lineRule="auto"/>
-        <w:ind w:left="720" w:hanging="360"/>
-        <w:rPr/>
-      </w:pPr>
-      <w:r>
-        <w:rPr>
-          <w:rtl w:val="0"/>
-        </w:rPr>
-        <w:t xml:space="preserve">The backend sends a response back to the app for display.</w:t>
-      </w:r>
-    </w:p>
-    <w:p>
-      <w:pPr>
-        <w:spacing w:after="240" w:before="0" w:lineRule="auto"/>
-        <w:rPr/>
-      </w:pPr>
-      <w:r>
-        <w:rPr>
-          <w:rtl w:val="0"/>
-        </w:rPr>
-        <w:t xml:space="preserve">This architecture keeps the AI model isolated from direct device access, improving modularity and safety.</w:t>
-      </w:r>
-    </w:p>
-    <w:p>
-      <w:pPr>
-        <w:spacing w:after="240" w:before="0" w:lineRule="auto"/>
-        <w:rPr/>
-      </w:pPr>
-      <w:r>
-        <w:rPr/>
+          <w:sz w:val="26"/>
+          <w:szCs w:val="26"/>
+        </w:rPr>
+      </w:pPr>
+      <w:r>
+        <w:rPr>
+          <w:rtl w:val="0"/>
+        </w:rPr>
+        <w:t xml:space="preserve">Figure 1:AI Architecture using Firebase AI for Web and Mobile Applications</w:t>
+      </w:r>
+      <w:r>
+        <w:rPr>
+          <w:rtl w:val="0"/>
+        </w:rPr>
+      </w:r>
+      <w:r>
         <w:drawing>
-          <wp:inline distB="114300" distT="114300" distL="114300" distR="114300">
-            <wp:extent cx="4314508" cy="3248025"/>
+          <wp:anchor allowOverlap="1" behindDoc="0" distB="114300" distT="114300" distL="114300" distR="114300" hidden="0" layoutInCell="1" locked="0" relativeHeight="0" simplePos="0">
+            <wp:simplePos x="0" y="0"/>
+            <wp:positionH relativeFrom="column">
+              <wp:posOffset>1003780</wp:posOffset>
+            </wp:positionH>
+            <wp:positionV relativeFrom="paragraph">
+              <wp:posOffset>390525</wp:posOffset>
+            </wp:positionV>
+            <wp:extent cx="3753167" cy="4972050"/>
             <wp:effectExtent b="0" l="0" r="0" t="0"/>
+            <wp:wrapTopAndBottom distB="114300" distT="114300"/>
             <wp:docPr id="1" name="image2.png"/>
             <a:graphic>
               <a:graphicData uri="http://schemas.openxmlformats.org/drawingml/2006/picture">
@@ -2153,7 +2736,7 @@
                     <pic:cNvPicPr preferRelativeResize="0"/>
                   </pic:nvPicPr>
                   <pic:blipFill>
-                    <a:blip r:embed="rId6"/>
+                    <a:blip r:embed="rId7"/>
                     <a:srcRect b="0" l="0" r="0" t="0"/>
                     <a:stretch>
                       <a:fillRect/>
@@ -2162,7 +2745,7 @@
                   <pic:spPr>
                     <a:xfrm>
                       <a:off x="0" y="0"/>
-                      <a:ext cx="4314508" cy="3248025"/>
+                      <a:ext cx="3753167" cy="4972050"/>
                     </a:xfrm>
                     <a:prstGeom prst="rect"/>
                     <a:ln/>
@@ -2170,13 +2753,8 @@
                 </pic:pic>
               </a:graphicData>
             </a:graphic>
-          </wp:inline>
+          </wp:anchor>
         </w:drawing>
-      </w:r>
-      <w:r>
-        <w:rPr>
-          <w:rtl w:val="0"/>
-        </w:rPr>
       </w:r>
     </w:p>
     <w:p>
@@ -2200,33 +2778,18 @@
           <w:rFonts w:ascii="Arial" w:cs="Arial" w:eastAsia="Arial" w:hAnsi="Arial"/>
           <w:b w:val="1"/>
           <w:bCs w:val="1"/>
+          <w:i w:val="0"/>
+          <w:iCs w:val="0"/>
+          <w:smallCaps w:val="0"/>
+          <w:strike w:val="0"/>
           <w:sz w:val="26"/>
           <w:szCs w:val="26"/>
-        </w:rPr>
-      </w:pPr>
-      <w:r>
-        <w:rPr>
-          <w:rtl w:val="0"/>
-        </w:rPr>
-      </w:r>
-    </w:p>
-    <w:p>
-      <w:pPr>
-        <w:keepNext w:val="1"/>
-        <w:keepLines w:val="0"/>
-        <w:pageBreakBefore w:val="0"/>
-        <w:widowControl w:val="1"/>
-        <w:pBdr>
-          <w:top w:space="0" w:sz="0" w:val="nil"/>
-          <w:left w:space="0" w:sz="0" w:val="nil"/>
-          <w:bottom w:space="0" w:sz="0" w:val="nil"/>
-          <w:right w:space="0" w:sz="0" w:val="nil"/>
-          <w:between w:space="0" w:sz="0" w:val="nil"/>
-        </w:pBdr>
-        <w:shd w:fill="auto" w:val="clear"/>
-        <w:spacing w:after="60" w:before="240" w:line="240" w:lineRule="auto"/>
-        <w:ind w:left="0" w:right="0" w:firstLine="0"/>
-        <w:jc w:val="left"/>
+          <w:u w:val="none"/>
+          <w:shd w:fill="auto" w:val="clear"/>
+          <w:vertAlign w:val="baseline"/>
+        </w:rPr>
+      </w:pPr>
+      <w:r>
         <w:rPr>
           <w:rFonts w:ascii="Arial" w:cs="Arial" w:eastAsia="Arial" w:hAnsi="Arial"/>
           <w:b w:val="1"/>
@@ -2240,22 +2803,6 @@
           <w:u w:val="none"/>
           <w:shd w:fill="auto" w:val="clear"/>
           <w:vertAlign w:val="baseline"/>
-        </w:rPr>
-      </w:pPr>
-      <w:r>
-        <w:rPr>
-          <w:rFonts w:ascii="Arial" w:cs="Arial" w:eastAsia="Arial" w:hAnsi="Arial"/>
-          <w:b w:val="1"/>
-          <w:bCs w:val="1"/>
-          <w:i w:val="0"/>
-          <w:iCs w:val="0"/>
-          <w:smallCaps w:val="0"/>
-          <w:strike w:val="0"/>
-          <w:sz w:val="26"/>
-          <w:szCs w:val="26"/>
-          <w:u w:val="none"/>
-          <w:shd w:fill="auto" w:val="clear"/>
-          <w:vertAlign w:val="baseline"/>
           <w:rtl w:val="0"/>
         </w:rPr>
         <w:t xml:space="preserve">D2 - </w:t>
@@ -2269,7 +2816,7 @@
           <w:szCs w:val="26"/>
           <w:rtl w:val="0"/>
         </w:rPr>
-        <w:t xml:space="preserve">Intent Output Format + Prompting Rules (Gemini)</w:t>
+        <w:t xml:space="preserve">Intent Output Format + Prompting Rules (Firebase AI)</w:t>
       </w:r>
       <w:r>
         <w:rPr>
@@ -2280,50 +2827,23 @@
     <w:p>
       <w:pPr>
         <w:spacing w:after="240" w:before="240" w:lineRule="auto"/>
-        <w:rPr/>
-      </w:pPr>
-      <w:r>
-        <w:rPr>
-          <w:rtl w:val="0"/>
-        </w:rPr>
-        <w:t xml:space="preserve">This design item specifies how Gemini must respond so the backend can execute actions reliably. Natural language is unpredictable, so the AI must output </w:t>
-      </w:r>
-      <w:r>
+        <w:ind w:left="0" w:firstLine="0"/>
+        <w:rPr/>
+      </w:pPr>
+      <w:r>
+        <w:rPr>
+          <w:rtl w:val="0"/>
+        </w:rPr>
+        <w:t xml:space="preserve">The AI system generates human-readable responses for the chat interface. Responses are used mainly for conversation, but the design also supports structured output for future smart-home commands.</w:t>
+      </w:r>
+    </w:p>
+    <w:p>
+      <w:pPr>
+        <w:spacing w:after="240" w:before="240" w:lineRule="auto"/>
         <w:rPr>
           <w:b w:val="1"/>
           <w:bCs w:val="1"/>
-          <w:rtl w:val="0"/>
-        </w:rPr>
-        <w:t xml:space="preserve">structured intent</w:t>
-      </w:r>
-      <w:r>
-        <w:rPr>
-          <w:rtl w:val="0"/>
-        </w:rPr>
-        <w:t xml:space="preserve">.</w:t>
-      </w:r>
-    </w:p>
-    <w:p>
-      <w:pPr>
-        <w:spacing w:after="240" w:before="240" w:lineRule="auto"/>
-        <w:rPr/>
-      </w:pPr>
-      <w:r>
-        <w:rPr>
-          <w:rtl w:val="0"/>
-        </w:rPr>
-        <w:t xml:space="preserve">The backend prompt instructs Gemini to return:</w:t>
-      </w:r>
-    </w:p>
-    <w:p>
-      <w:pPr>
-        <w:numPr>
-          <w:ilvl w:val="0"/>
-          <w:numId w:val="5"/>
-        </w:numPr>
-        <w:spacing w:after="0" w:afterAutospacing="0" w:before="240" w:lineRule="auto"/>
-        <w:ind w:left="720" w:hanging="360"/>
-        <w:rPr/>
+        </w:rPr>
       </w:pPr>
       <w:r>
         <w:rPr>
@@ -2331,60 +2851,12 @@
           <w:bCs w:val="1"/>
           <w:rtl w:val="0"/>
         </w:rPr>
-        <w:t xml:space="preserve">Intent JSON</w:t>
-      </w:r>
-      <w:r>
-        <w:rPr>
-          <w:rtl w:val="0"/>
-        </w:rPr>
-        <w:t xml:space="preserve"> (machine-readable)</w:t>
-      </w:r>
-    </w:p>
-    <w:p>
-      <w:pPr>
-        <w:numPr>
-          <w:ilvl w:val="0"/>
-          <w:numId w:val="5"/>
-        </w:numPr>
-        <w:spacing w:after="240" w:before="0" w:beforeAutospacing="0" w:lineRule="auto"/>
-        <w:ind w:left="720" w:hanging="360"/>
-        <w:rPr/>
-      </w:pPr>
-      <w:r>
-        <w:rPr>
-          <w:b w:val="1"/>
-          <w:bCs w:val="1"/>
-          <w:rtl w:val="0"/>
-        </w:rPr>
-        <w:t xml:space="preserve">User reply text</w:t>
-      </w:r>
-      <w:r>
-        <w:rPr>
-          <w:rtl w:val="0"/>
-        </w:rPr>
-        <w:t xml:space="preserve"> (human-readable)</w:t>
-      </w:r>
-    </w:p>
-    <w:p>
-      <w:pPr>
-        <w:spacing w:after="240" w:before="240" w:lineRule="auto"/>
-        <w:rPr>
-          <w:b w:val="1"/>
-          <w:bCs w:val="1"/>
-        </w:rPr>
-      </w:pPr>
-      <w:r>
-        <w:rPr>
-          <w:b w:val="1"/>
-          <w:bCs w:val="1"/>
-          <w:rtl w:val="0"/>
-        </w:rPr>
         <w:t xml:space="preserve">Example intent JSON</w:t>
       </w:r>
     </w:p>
     <w:p>
       <w:pPr>
-        <w:spacing w:after="240" w:before="240" w:lineRule="auto"/>
+        <w:spacing w:after="0" w:before="0" w:lineRule="auto"/>
         <w:rPr/>
       </w:pPr>
       <w:r>
@@ -2396,7 +2868,7 @@
     </w:p>
     <w:p>
       <w:pPr>
-        <w:spacing w:after="240" w:before="240" w:lineRule="auto"/>
+        <w:spacing w:after="0" w:before="0" w:lineRule="auto"/>
         <w:rPr/>
       </w:pPr>
       <w:r>
@@ -2408,7 +2880,7 @@
     </w:p>
     <w:p>
       <w:pPr>
-        <w:spacing w:after="240" w:before="240" w:lineRule="auto"/>
+        <w:spacing w:after="0" w:before="0" w:lineRule="auto"/>
         <w:rPr/>
       </w:pPr>
       <w:r>
@@ -2420,7 +2892,7 @@
     </w:p>
     <w:p>
       <w:pPr>
-        <w:spacing w:after="240" w:before="240" w:lineRule="auto"/>
+        <w:spacing w:after="0" w:before="0" w:lineRule="auto"/>
         <w:rPr/>
       </w:pPr>
       <w:r>
@@ -2432,19 +2904,7 @@
     </w:p>
     <w:p>
       <w:pPr>
-        <w:spacing w:after="240" w:before="240" w:lineRule="auto"/>
-        <w:rPr/>
-      </w:pPr>
-      <w:r>
-        <w:rPr>
-          <w:rtl w:val="0"/>
-        </w:rPr>
-        <w:t xml:space="preserve"> "value": ""</w:t>
-      </w:r>
-    </w:p>
-    <w:p>
-      <w:pPr>
-        <w:spacing w:after="240" w:before="240" w:lineRule="auto"/>
+        <w:spacing w:after="0" w:before="0" w:lineRule="auto"/>
         <w:rPr/>
       </w:pPr>
       <w:r>
@@ -2456,50 +2916,14 @@
     </w:p>
     <w:p>
       <w:pPr>
-        <w:spacing w:after="240" w:before="240" w:lineRule="auto"/>
-        <w:ind w:left="0" w:firstLine="0"/>
-        <w:rPr/>
-      </w:pPr>
-      <w:r>
-        <w:rPr>
-          <w:rtl w:val="0"/>
-        </w:rPr>
-      </w:r>
-    </w:p>
-    <w:p>
-      <w:pPr>
-        <w:spacing w:after="240" w:before="240" w:lineRule="auto"/>
-        <w:ind w:left="720" w:firstLine="0"/>
-        <w:rPr/>
-      </w:pPr>
-      <w:r>
-        <w:rPr>
-          <w:rtl w:val="0"/>
-        </w:rPr>
-      </w:r>
-    </w:p>
-    <w:p>
-      <w:pPr>
-        <w:spacing w:after="240" w:before="240" w:lineRule="auto"/>
-        <w:ind w:left="720" w:firstLine="0"/>
-        <w:rPr/>
-      </w:pPr>
-      <w:r>
-        <w:rPr>
-          <w:rtl w:val="0"/>
-        </w:rPr>
-      </w:r>
-    </w:p>
-    <w:p>
-      <w:pPr>
-        <w:spacing w:after="240" w:before="240" w:lineRule="auto"/>
-        <w:ind w:left="720" w:firstLine="0"/>
-        <w:rPr/>
-      </w:pPr>
-      <w:r>
-        <w:rPr>
-          <w:rtl w:val="0"/>
-        </w:rPr>
+        <w:spacing w:after="0" w:before="0" w:lineRule="auto"/>
+        <w:rPr/>
+      </w:pPr>
+      <w:r>
+        <w:rPr>
+          <w:rtl w:val="0"/>
+        </w:rPr>
+        <w:t xml:space="preserve">Using Firebase AI allows flexible responses while keeping the system ready for command interpretation.</w:t>
       </w:r>
     </w:p>
     <w:p>
@@ -2576,7 +3000,7 @@
                     <pic:cNvPicPr preferRelativeResize="0"/>
                   </pic:nvPicPr>
                   <pic:blipFill>
-                    <a:blip r:embed="rId7"/>
+                    <a:blip r:embed="rId8"/>
                     <a:srcRect b="0" l="0" r="0" t="0"/>
                     <a:stretch>
                       <a:fillRect/>
@@ -2599,310 +3023,38 @@
     </w:p>
     <w:p>
       <w:pPr>
-        <w:spacing w:after="240" w:before="240" w:lineRule="auto"/>
-        <w:rPr>
-          <w:b w:val="1"/>
-          <w:bCs w:val="1"/>
-          <w:sz w:val="26"/>
-          <w:szCs w:val="26"/>
-        </w:rPr>
-      </w:pPr>
-      <w:r>
-        <w:rPr>
-          <w:b w:val="1"/>
-          <w:bCs w:val="1"/>
-          <w:sz w:val="26"/>
-          <w:szCs w:val="26"/>
-          <w:rtl w:val="0"/>
-        </w:rPr>
-        <w:t xml:space="preserve">Description</w:t>
-      </w:r>
-    </w:p>
-    <w:p>
-      <w:pPr>
-        <w:spacing w:after="240" w:before="240" w:lineRule="auto"/>
-        <w:rPr/>
-      </w:pPr>
-      <w:r>
-        <w:rPr>
-          <w:rtl w:val="0"/>
-        </w:rPr>
-        <w:t xml:space="preserve">This design item describes the mobile AI chat interface implemented in </w:t>
-      </w:r>
-      <w:r>
-        <w:rPr>
-          <w:rFonts w:ascii="Roboto Mono" w:cs="Roboto Mono" w:eastAsia="Roboto Mono" w:hAnsi="Roboto Mono"/>
-          <w:rtl w:val="0"/>
-        </w:rPr>
-        <w:t xml:space="preserve">AiScreen.tsx</w:t>
-      </w:r>
-      <w:r>
-        <w:rPr>
-          <w:rtl w:val="0"/>
-        </w:rPr>
-        <w:t xml:space="preserve">. The UI enables users to send natural language commands to the backend and receive AI-generated responses.</w:t>
-      </w:r>
-    </w:p>
-    <w:p>
-      <w:pPr>
-        <w:spacing w:after="240" w:before="240" w:lineRule="auto"/>
-        <w:rPr>
-          <w:b w:val="1"/>
-          <w:bCs w:val="1"/>
-          <w:sz w:val="26"/>
-          <w:szCs w:val="26"/>
-        </w:rPr>
-      </w:pPr>
-      <w:r>
-        <w:rPr>
-          <w:b w:val="1"/>
-          <w:bCs w:val="1"/>
-          <w:sz w:val="26"/>
-          <w:szCs w:val="26"/>
-          <w:rtl w:val="0"/>
-        </w:rPr>
-        <w:t xml:space="preserve">UI Responsibilities</w:t>
-      </w:r>
-    </w:p>
-    <w:p>
-      <w:pPr>
-        <w:keepNext w:val="1"/>
-        <w:numPr>
-          <w:ilvl w:val="0"/>
-          <w:numId w:val="6"/>
-        </w:numPr>
-        <w:spacing w:after="0" w:afterAutospacing="0" w:before="240" w:lineRule="auto"/>
-        <w:ind w:left="720" w:hanging="360"/>
-      </w:pPr>
-      <w:r>
-        <w:rPr>
-          <w:rtl w:val="0"/>
-        </w:rPr>
-        <w:t xml:space="preserve">Maintain a message list with sender type (</w:t>
-      </w:r>
-      <w:r>
-        <w:rPr>
-          <w:rFonts w:ascii="Roboto Mono" w:cs="Roboto Mono" w:eastAsia="Roboto Mono" w:hAnsi="Roboto Mono"/>
-          <w:rtl w:val="0"/>
-        </w:rPr>
-        <w:t xml:space="preserve">user</w:t>
-      </w:r>
-      <w:r>
-        <w:rPr>
-          <w:rtl w:val="0"/>
-        </w:rPr>
-        <w:t xml:space="preserve"> / </w:t>
-      </w:r>
-      <w:r>
-        <w:rPr>
-          <w:rFonts w:ascii="Roboto Mono" w:cs="Roboto Mono" w:eastAsia="Roboto Mono" w:hAnsi="Roboto Mono"/>
-          <w:rtl w:val="0"/>
-        </w:rPr>
-        <w:t xml:space="preserve">ai</w:t>
-      </w:r>
-      <w:r>
-        <w:rPr>
-          <w:rtl w:val="0"/>
-        </w:rPr>
-        <w:t xml:space="preserve">)</w:t>
-      </w:r>
-    </w:p>
-    <w:p>
-      <w:pPr>
-        <w:keepNext w:val="1"/>
-        <w:numPr>
-          <w:ilvl w:val="0"/>
-          <w:numId w:val="6"/>
-        </w:numPr>
-        <w:spacing w:after="0" w:afterAutospacing="0" w:before="0" w:beforeAutospacing="0" w:lineRule="auto"/>
-        <w:ind w:left="720" w:hanging="360"/>
-      </w:pPr>
-      <w:r>
-        <w:rPr>
-          <w:rtl w:val="0"/>
-        </w:rPr>
-        <w:t xml:space="preserve">Provide input field and Send button</w:t>
-      </w:r>
-    </w:p>
-    <w:p>
-      <w:pPr>
-        <w:keepNext w:val="1"/>
-        <w:numPr>
-          <w:ilvl w:val="0"/>
-          <w:numId w:val="6"/>
-        </w:numPr>
-        <w:spacing w:after="0" w:afterAutospacing="0" w:before="0" w:beforeAutospacing="0" w:lineRule="auto"/>
-        <w:ind w:left="720" w:hanging="360"/>
-      </w:pPr>
-      <w:r>
-        <w:rPr>
-          <w:rtl w:val="0"/>
-        </w:rPr>
-        <w:t xml:space="preserve">Display loading indicator (“AI is typing…”)</w:t>
-      </w:r>
-    </w:p>
-    <w:p>
-      <w:pPr>
-        <w:keepNext w:val="1"/>
-        <w:numPr>
-          <w:ilvl w:val="0"/>
-          <w:numId w:val="6"/>
-        </w:numPr>
-        <w:spacing w:after="240" w:before="0" w:beforeAutospacing="0" w:lineRule="auto"/>
-        <w:ind w:left="720" w:hanging="360"/>
-      </w:pPr>
-      <w:r>
-        <w:rPr>
-          <w:rtl w:val="0"/>
-        </w:rPr>
-        <w:t xml:space="preserve">Automatically scroll to latest message</w:t>
-      </w:r>
-    </w:p>
-    <w:p>
-      <w:pPr>
-        <w:spacing w:after="240" w:before="240" w:lineRule="auto"/>
-        <w:ind w:left="0" w:firstLine="0"/>
-        <w:rPr/>
-      </w:pPr>
-      <w:r>
-        <w:rPr>
-          <w:rtl w:val="0"/>
-        </w:rPr>
-        <w:t xml:space="preserve">Use environment variable </w:t>
-      </w:r>
-      <w:r>
-        <w:rPr>
-          <w:rFonts w:ascii="Roboto Mono" w:cs="Roboto Mono" w:eastAsia="Roboto Mono" w:hAnsi="Roboto Mono"/>
-          <w:rtl w:val="0"/>
-        </w:rPr>
-        <w:t xml:space="preserve">EXPO_PUBLIC_API_URL</w:t>
-      </w:r>
-      <w:r>
-        <w:rPr>
-          <w:rtl w:val="0"/>
-        </w:rPr>
-        <w:t xml:space="preserve"> for backend configuration</w:t>
-      </w:r>
-    </w:p>
-    <w:p>
-      <w:pPr>
-        <w:spacing w:after="240" w:before="240" w:lineRule="auto"/>
-        <w:rPr>
-          <w:b w:val="1"/>
-          <w:bCs w:val="1"/>
-          <w:sz w:val="26"/>
-          <w:szCs w:val="26"/>
-        </w:rPr>
-      </w:pPr>
-      <w:r>
-        <w:rPr>
-          <w:b w:val="1"/>
-          <w:bCs w:val="1"/>
-          <w:sz w:val="26"/>
-          <w:szCs w:val="26"/>
-          <w:rtl w:val="0"/>
-        </w:rPr>
-        <w:t xml:space="preserve">API Contract</w:t>
-      </w:r>
-    </w:p>
-    <w:p>
-      <w:pPr>
-        <w:spacing w:after="240" w:before="240" w:lineRule="auto"/>
-        <w:rPr>
-          <w:rFonts w:ascii="Roboto Mono" w:cs="Roboto Mono" w:eastAsia="Roboto Mono" w:hAnsi="Roboto Mono"/>
-        </w:rPr>
-      </w:pPr>
-      <w:r>
-        <w:rPr>
-          <w:b w:val="1"/>
-          <w:bCs w:val="1"/>
-          <w:rtl w:val="0"/>
-        </w:rPr>
-        <w:t xml:space="preserve">Endpoint: </w:t>
-      </w:r>
-      <w:r>
-        <w:rPr>
-          <w:rFonts w:ascii="Roboto Mono" w:cs="Roboto Mono" w:eastAsia="Roboto Mono" w:hAnsi="Roboto Mono"/>
-          <w:rtl w:val="0"/>
-        </w:rPr>
-        <w:t xml:space="preserve">POST {BASE_URL}/api/ai-chat</w:t>
-      </w:r>
-    </w:p>
-    <w:p>
-      <w:pPr>
-        <w:spacing w:after="240" w:before="240" w:lineRule="auto"/>
-        <w:rPr>
-          <w:b w:val="1"/>
-          <w:bCs w:val="1"/>
-        </w:rPr>
-      </w:pPr>
-      <w:r>
-        <w:rPr>
-          <w:b w:val="1"/>
-          <w:bCs w:val="1"/>
-          <w:rtl w:val="0"/>
-        </w:rPr>
-        <w:t xml:space="preserve">Request Body</w:t>
-      </w:r>
-    </w:p>
-    <w:p>
-      <w:pPr>
-        <w:spacing w:after="240" w:before="240" w:lineRule="auto"/>
-        <w:rPr/>
-      </w:pPr>
-      <w:r>
-        <w:rPr>
-          <w:rtl w:val="0"/>
-        </w:rPr>
-        <w:t xml:space="preserve">{ "message": "Open the door" }</w:t>
-      </w:r>
-    </w:p>
-    <w:p>
-      <w:pPr>
-        <w:spacing w:after="240" w:before="240" w:lineRule="auto"/>
-        <w:rPr>
-          <w:b w:val="1"/>
-          <w:bCs w:val="1"/>
-        </w:rPr>
-      </w:pPr>
-      <w:r>
-        <w:rPr>
-          <w:b w:val="1"/>
-          <w:bCs w:val="1"/>
-          <w:rtl w:val="0"/>
-        </w:rPr>
-        <w:t xml:space="preserve">Response Body</w:t>
-      </w:r>
-    </w:p>
-    <w:p>
-      <w:pPr>
-        <w:keepNext w:val="1"/>
-        <w:spacing w:after="60" w:before="240" w:lineRule="auto"/>
-        <w:rPr/>
-      </w:pPr>
-      <w:r>
-        <w:rPr>
-          <w:rtl w:val="0"/>
-        </w:rPr>
-        <w:t xml:space="preserve">{ "reply": "Door opened successfully." }</w:t>
-      </w:r>
-    </w:p>
-    <w:p>
-      <w:pPr>
-        <w:keepNext w:val="1"/>
-        <w:spacing w:after="60" w:before="240" w:lineRule="auto"/>
-        <w:rPr/>
-      </w:pPr>
-      <w:r>
-        <w:rPr>
-          <w:rtl w:val="0"/>
-        </w:rPr>
-      </w:r>
-    </w:p>
-    <w:p>
-      <w:pPr>
-        <w:keepNext w:val="1"/>
-        <w:spacing w:after="60" w:before="240" w:lineRule="auto"/>
+        <w:rPr/>
+      </w:pPr>
+      <w:r>
+        <w:rPr>
+          <w:rtl w:val="0"/>
+        </w:rPr>
+        <w:t xml:space="preserve">The AI what interface is implemented in both the web and mobile applications. The UI keeps message history, allows user input, shows loading state, and displays AI responses.Web version uses generateContent() for each message.Mobile version uses a chat session to keep conversation context.Both versions use the same Firebase configuration.</w:t>
+      </w:r>
+    </w:p>
+    <w:p>
+      <w:pPr>
+        <w:rPr/>
+      </w:pPr>
+      <w:r>
+        <w:rPr>
+          <w:rtl w:val="0"/>
+        </w:rPr>
+        <w:t xml:space="preserve">This provides consistent behaviour across platforms</w:t>
+      </w:r>
+    </w:p>
+    <w:p>
+      <w:pPr>
+        <w:rPr/>
+      </w:pPr>
+      <w:r>
+        <w:rPr>
+          <w:rtl w:val="0"/>
+        </w:rPr>
+      </w:r>
+    </w:p>
+    <w:p>
+      <w:pPr>
         <w:rPr/>
       </w:pPr>
       <w:r>
@@ -2911,18 +3063,11 @@
         </w:rPr>
         <w:t xml:space="preserve">Figure – Sequence Diagram</w:t>
       </w:r>
-    </w:p>
-    <w:p>
-      <w:pPr>
-        <w:keepNext w:val="1"/>
-        <w:spacing w:after="60" w:before="240" w:lineRule="auto"/>
-        <w:rPr/>
-      </w:pPr>
       <w:r>
         <w:rPr/>
         <w:drawing>
           <wp:inline distB="114300" distT="114300" distL="114300" distR="114300">
-            <wp:extent cx="4762500" cy="2305368"/>
+            <wp:extent cx="5760410" cy="2755900"/>
             <wp:effectExtent b="0" l="0" r="0" t="0"/>
             <wp:docPr id="2" name="image4.png"/>
             <a:graphic>
@@ -2933,7 +3078,7 @@
                     <pic:cNvPicPr preferRelativeResize="0"/>
                   </pic:nvPicPr>
                   <pic:blipFill>
-                    <a:blip r:embed="rId8"/>
+                    <a:blip r:embed="rId9"/>
                     <a:srcRect b="0" l="0" r="0" t="0"/>
                     <a:stretch>
                       <a:fillRect/>
@@ -2942,7 +3087,7 @@
                   <pic:spPr>
                     <a:xfrm>
                       <a:off x="0" y="0"/>
-                      <a:ext cx="4762500" cy="2305368"/>
+                      <a:ext cx="5760410" cy="2755900"/>
                     </a:xfrm>
                     <a:prstGeom prst="rect"/>
                     <a:ln/>
@@ -3127,20 +3272,7 @@
         <w:rPr>
           <w:rtl w:val="0"/>
         </w:rPr>
-        <w:t xml:space="preserve">Display configuration error if </w:t>
-      </w:r>
-      <w:r>
-        <w:rPr>
-          <w:rFonts w:ascii="Roboto Mono" w:cs="Roboto Mono" w:eastAsia="Roboto Mono" w:hAnsi="Roboto Mono"/>
-          <w:rtl w:val="0"/>
-        </w:rPr>
-        <w:t xml:space="preserve">EXPO_PUBLIC_API_URL</w:t>
-      </w:r>
-      <w:r>
-        <w:rPr>
-          <w:rtl w:val="0"/>
-        </w:rPr>
-        <w:t xml:space="preserve"> is missing</w:t>
+        <w:t xml:space="preserve">Display configuration error if Firebase configuration is missing </w:t>
       </w:r>
     </w:p>
     <w:p>
@@ -3158,7 +3290,7 @@
         <w:rPr>
           <w:rtl w:val="0"/>
         </w:rPr>
-        <w:t xml:space="preserve">Show fallback message if backend fails or returns invalid data</w:t>
+        <w:t xml:space="preserve">Show fallback message if AI request fails</w:t>
       </w:r>
     </w:p>
     <w:p>
@@ -3187,7 +3319,7 @@
         <w:keepNext w:val="1"/>
         <w:numPr>
           <w:ilvl w:val="0"/>
-          <w:numId w:val="10"/>
+          <w:numId w:val="11"/>
         </w:numPr>
         <w:spacing w:after="0" w:afterAutospacing="0" w:before="240" w:lineRule="auto"/>
         <w:ind w:left="720" w:hanging="360"/>
@@ -3199,7 +3331,7 @@
           <w:bCs w:val="1"/>
           <w:rtl w:val="0"/>
         </w:rPr>
-        <w:t xml:space="preserve">Missing backend URL:</w:t>
+        <w:t xml:space="preserve">Missing backend configuration:</w:t>
       </w:r>
       <w:r>
         <w:rPr>
@@ -3213,7 +3345,7 @@
         <w:keepNext w:val="1"/>
         <w:numPr>
           <w:ilvl w:val="0"/>
-          <w:numId w:val="10"/>
+          <w:numId w:val="11"/>
         </w:numPr>
         <w:spacing w:after="0" w:afterAutospacing="0" w:before="0" w:beforeAutospacing="0" w:lineRule="auto"/>
         <w:ind w:left="720" w:hanging="360"/>
@@ -3225,7 +3357,7 @@
           <w:bCs w:val="1"/>
           <w:rtl w:val="0"/>
         </w:rPr>
-        <w:t xml:space="preserve">Backend unreachable:</w:t>
+        <w:t xml:space="preserve">Network Error:</w:t>
       </w:r>
       <w:r>
         <w:rPr>
@@ -3239,7 +3371,7 @@
         <w:keepNext w:val="1"/>
         <w:numPr>
           <w:ilvl w:val="0"/>
-          <w:numId w:val="10"/>
+          <w:numId w:val="11"/>
         </w:numPr>
         <w:spacing w:after="0" w:afterAutospacing="0" w:before="0" w:beforeAutospacing="0" w:lineRule="auto"/>
         <w:ind w:left="720" w:hanging="360"/>
@@ -3265,7 +3397,7 @@
         <w:keepNext w:val="1"/>
         <w:numPr>
           <w:ilvl w:val="0"/>
-          <w:numId w:val="10"/>
+          <w:numId w:val="11"/>
         </w:numPr>
         <w:spacing w:after="240" w:before="0" w:beforeAutospacing="0" w:lineRule="auto"/>
         <w:ind w:left="720" w:hanging="360"/>
@@ -3463,7 +3595,7 @@
                     <pic:cNvPicPr preferRelativeResize="0"/>
                   </pic:nvPicPr>
                   <pic:blipFill>
-                    <a:blip r:embed="rId9"/>
+                    <a:blip r:embed="rId10"/>
                     <a:srcRect b="0" l="0" r="0" t="0"/>
                     <a:stretch>
                       <a:fillRect/>
@@ -3482,6 +3614,810 @@
             </a:graphic>
           </wp:anchor>
         </w:drawing>
+      </w:r>
+    </w:p>
+    <w:p>
+      <w:pPr>
+        <w:ind w:left="0" w:firstLine="0"/>
+        <w:rPr/>
+      </w:pPr>
+      <w:r>
+        <w:rPr>
+          <w:rtl w:val="0"/>
+        </w:rPr>
+      </w:r>
+    </w:p>
+    <w:p>
+      <w:pPr>
+        <w:ind w:left="0" w:firstLine="0"/>
+        <w:rPr/>
+      </w:pPr>
+      <w:r>
+        <w:rPr>
+          <w:rtl w:val="0"/>
+        </w:rPr>
+      </w:r>
+    </w:p>
+    <w:p>
+      <w:pPr>
+        <w:ind w:left="0" w:firstLine="0"/>
+        <w:rPr>
+          <w:b w:val="1"/>
+          <w:bCs w:val="1"/>
+          <w:sz w:val="32"/>
+          <w:szCs w:val="32"/>
+        </w:rPr>
+      </w:pPr>
+      <w:r>
+        <w:rPr>
+          <w:b w:val="1"/>
+          <w:bCs w:val="1"/>
+          <w:sz w:val="32"/>
+          <w:szCs w:val="32"/>
+          <w:rtl w:val="0"/>
+        </w:rPr>
+        <w:t xml:space="preserve">D5 – Speech Recognition Integration and Voice Navigation Design</w:t>
+      </w:r>
+    </w:p>
+    <w:p>
+      <w:pPr>
+        <w:keepNext w:val="1"/>
+        <w:spacing w:after="240" w:before="240" w:lineRule="auto"/>
+        <w:rPr/>
+      </w:pPr>
+      <w:r>
+        <w:rPr>
+          <w:rtl w:val="0"/>
+        </w:rPr>
+      </w:r>
+    </w:p>
+    <w:p>
+      <w:pPr>
+        <w:keepNext w:val="1"/>
+        <w:numPr>
+          <w:ilvl w:val="0"/>
+          <w:numId w:val="5"/>
+        </w:numPr>
+        <w:spacing w:after="240" w:before="240" w:lineRule="auto"/>
+        <w:ind w:left="720" w:hanging="360"/>
+        <w:rPr>
+          <w:b w:val="1"/>
+          <w:bCs w:val="1"/>
+        </w:rPr>
+      </w:pPr>
+      <w:r>
+        <w:rPr>
+          <w:b w:val="1"/>
+          <w:bCs w:val="1"/>
+          <w:rtl w:val="0"/>
+        </w:rPr>
+        <w:t xml:space="preserve">Description</w:t>
+      </w:r>
+    </w:p>
+    <w:p>
+      <w:pPr>
+        <w:keepNext w:val="1"/>
+        <w:spacing w:after="240" w:before="240" w:lineRule="auto"/>
+        <w:rPr/>
+      </w:pPr>
+      <w:r>
+        <w:rPr>
+          <w:rtl w:val="0"/>
+        </w:rPr>
+        <w:t xml:space="preserve">This design item describes the integration of speech recognition into the mobile application using Expo and an external speech recognition library. The feature allows users to control the Interactive House system using spoken commands instead of manual text input.</w:t>
+      </w:r>
+    </w:p>
+    <w:p>
+      <w:pPr>
+        <w:keepNext w:val="1"/>
+        <w:numPr>
+          <w:ilvl w:val="0"/>
+          <w:numId w:val="7"/>
+        </w:numPr>
+        <w:spacing w:after="240" w:before="240" w:lineRule="auto"/>
+        <w:ind w:left="720" w:hanging="360"/>
+        <w:rPr>
+          <w:b w:val="1"/>
+          <w:bCs w:val="1"/>
+        </w:rPr>
+      </w:pPr>
+      <w:r>
+        <w:rPr>
+          <w:b w:val="1"/>
+          <w:bCs w:val="1"/>
+          <w:rtl w:val="0"/>
+        </w:rPr>
+        <w:t xml:space="preserve">Technology and Build Configuration</w:t>
+      </w:r>
+    </w:p>
+    <w:p>
+      <w:pPr>
+        <w:keepNext w:val="1"/>
+        <w:spacing w:after="240" w:before="240" w:lineRule="auto"/>
+        <w:rPr/>
+      </w:pPr>
+      <w:r>
+        <w:rPr>
+          <w:rtl w:val="0"/>
+        </w:rPr>
+        <w:t xml:space="preserve">The speech recognition functionality requires native device capabilities that are not available in the standard Expo Go environment. Therefore, a custom Expo development build was created to support the external speech recognition library and enable microphone access and real-time voice processing.</w:t>
+      </w:r>
+    </w:p>
+    <w:p>
+      <w:pPr>
+        <w:keepNext w:val="1"/>
+        <w:numPr>
+          <w:ilvl w:val="0"/>
+          <w:numId w:val="3"/>
+        </w:numPr>
+        <w:spacing w:after="240" w:before="240" w:lineRule="auto"/>
+        <w:ind w:left="720" w:hanging="360"/>
+        <w:rPr>
+          <w:b w:val="1"/>
+          <w:bCs w:val="1"/>
+        </w:rPr>
+      </w:pPr>
+      <w:r>
+        <w:rPr>
+          <w:b w:val="1"/>
+          <w:bCs w:val="1"/>
+          <w:rtl w:val="0"/>
+        </w:rPr>
+        <w:t xml:space="preserve">Architecture Integration</w:t>
+      </w:r>
+    </w:p>
+    <w:p>
+      <w:pPr>
+        <w:keepNext w:val="1"/>
+        <w:spacing w:after="240" w:before="240" w:lineRule="auto"/>
+        <w:rPr/>
+      </w:pPr>
+      <w:r>
+        <w:rPr>
+          <w:rtl w:val="0"/>
+        </w:rPr>
+        <w:t xml:space="preserve">The speech recognition module is implemented as a dedicated screen (tab) within the mobile application. The module interacts with the existing navigation and AI chat system.</w:t>
+      </w:r>
+    </w:p>
+    <w:p>
+      <w:pPr>
+        <w:keepNext w:val="1"/>
+        <w:spacing w:after="240" w:before="240" w:lineRule="auto"/>
+        <w:rPr/>
+      </w:pPr>
+      <w:r>
+        <w:rPr>
+          <w:rtl w:val="0"/>
+        </w:rPr>
+      </w:r>
+    </w:p>
+    <w:p>
+      <w:pPr>
+        <w:keepNext w:val="1"/>
+        <w:spacing w:after="240" w:before="240" w:lineRule="auto"/>
+        <w:rPr/>
+      </w:pPr>
+      <w:r>
+        <w:rPr>
+          <w:rtl w:val="0"/>
+        </w:rPr>
+        <w:t xml:space="preserve">The interaction flow is:</w:t>
+      </w:r>
+    </w:p>
+    <w:p>
+      <w:pPr>
+        <w:keepNext w:val="1"/>
+        <w:spacing w:after="240" w:before="240" w:lineRule="auto"/>
+        <w:rPr/>
+      </w:pPr>
+      <w:r>
+        <w:rPr>
+          <w:rtl w:val="0"/>
+        </w:rPr>
+        <w:t xml:space="preserve">1. The user opens the Speech Recognition tab.</w:t>
+      </w:r>
+    </w:p>
+    <w:p>
+      <w:pPr>
+        <w:keepNext w:val="1"/>
+        <w:spacing w:after="240" w:before="240" w:lineRule="auto"/>
+        <w:rPr/>
+      </w:pPr>
+      <w:r>
+        <w:rPr>
+          <w:rtl w:val="0"/>
+        </w:rPr>
+        <w:t xml:space="preserve">2. The user activates the microphone using the UI control.</w:t>
+      </w:r>
+    </w:p>
+    <w:p>
+      <w:pPr>
+        <w:keepNext w:val="1"/>
+        <w:spacing w:after="240" w:before="240" w:lineRule="auto"/>
+        <w:rPr/>
+      </w:pPr>
+      <w:r>
+        <w:rPr>
+          <w:rtl w:val="0"/>
+        </w:rPr>
+        <w:t xml:space="preserve">3. Spoken input is captured and converted into text using the speech recognition library.</w:t>
+      </w:r>
+    </w:p>
+    <w:p>
+      <w:pPr>
+        <w:keepNext w:val="1"/>
+        <w:spacing w:after="240" w:before="240" w:lineRule="auto"/>
+        <w:rPr/>
+      </w:pPr>
+      <w:r>
+        <w:rPr>
+          <w:rtl w:val="0"/>
+        </w:rPr>
+        <w:t xml:space="preserve">4. The recognized text is displayed and forwarded to the backend AI API. (Future feature)</w:t>
+      </w:r>
+    </w:p>
+    <w:p>
+      <w:pPr>
+        <w:keepNext w:val="1"/>
+        <w:spacing w:after="240" w:before="240" w:lineRule="auto"/>
+        <w:rPr/>
+      </w:pPr>
+      <w:r>
+        <w:rPr>
+          <w:rtl w:val="0"/>
+        </w:rPr>
+        <w:t xml:space="preserve">5. The backend processes the command and returns a response.(Future feature)</w:t>
+      </w:r>
+    </w:p>
+    <w:p>
+      <w:pPr>
+        <w:keepNext w:val="1"/>
+        <w:spacing w:after="240" w:before="240" w:lineRule="auto"/>
+        <w:rPr/>
+      </w:pPr>
+      <w:r>
+        <w:rPr>
+          <w:rtl w:val="0"/>
+        </w:rPr>
+        <w:t xml:space="preserve">The application navigates to the relevant screen or updates the system state based on the interpreted command. </w:t>
+      </w:r>
+    </w:p>
+    <w:p>
+      <w:pPr>
+        <w:keepNext w:val="1"/>
+        <w:numPr>
+          <w:ilvl w:val="0"/>
+          <w:numId w:val="1"/>
+        </w:numPr>
+        <w:spacing w:after="240" w:before="240" w:lineRule="auto"/>
+        <w:ind w:left="720" w:hanging="360"/>
+        <w:rPr>
+          <w:b w:val="1"/>
+          <w:bCs w:val="1"/>
+        </w:rPr>
+      </w:pPr>
+      <w:r>
+        <w:rPr>
+          <w:b w:val="1"/>
+          <w:bCs w:val="1"/>
+          <w:rtl w:val="0"/>
+        </w:rPr>
+        <w:t xml:space="preserve">Navigation Integration</w:t>
+      </w:r>
+    </w:p>
+    <w:p>
+      <w:pPr>
+        <w:keepNext w:val="1"/>
+        <w:spacing w:after="240" w:before="240" w:lineRule="auto"/>
+        <w:rPr/>
+      </w:pPr>
+      <w:r>
+        <w:rPr>
+          <w:rtl w:val="0"/>
+        </w:rPr>
+        <w:t xml:space="preserve">Speech recognition can trigger navigation between different screens in the application. This allows users to move between system features using voice commands, improving accessibility and interaction efficiency.</w:t>
+      </w:r>
+    </w:p>
+    <w:p>
+      <w:pPr>
+        <w:keepNext w:val="1"/>
+        <w:numPr>
+          <w:ilvl w:val="0"/>
+          <w:numId w:val="12"/>
+        </w:numPr>
+        <w:spacing w:after="240" w:before="240" w:lineRule="auto"/>
+        <w:ind w:left="720" w:hanging="360"/>
+        <w:rPr>
+          <w:b w:val="1"/>
+          <w:bCs w:val="1"/>
+        </w:rPr>
+      </w:pPr>
+      <w:r>
+        <w:rPr>
+          <w:b w:val="1"/>
+          <w:bCs w:val="1"/>
+          <w:rtl w:val="0"/>
+        </w:rPr>
+        <w:t xml:space="preserve">Global floating voice control interface</w:t>
+      </w:r>
+    </w:p>
+    <w:p>
+      <w:pPr>
+        <w:keepNext w:val="1"/>
+        <w:spacing w:after="240" w:before="240" w:lineRule="auto"/>
+        <w:rPr/>
+      </w:pPr>
+      <w:r>
+        <w:rPr>
+          <w:rtl w:val="0"/>
+        </w:rPr>
+        <w:t xml:space="preserve">The speech system was full redesigned and the dedicated speech screen was removed and replaced with a persistent floating voice control component.</w:t>
+      </w:r>
+    </w:p>
+    <w:p>
+      <w:pPr>
+        <w:keepNext w:val="1"/>
+        <w:spacing w:after="240" w:before="240" w:lineRule="auto"/>
+        <w:rPr/>
+      </w:pPr>
+      <w:r>
+        <w:rPr>
+          <w:rtl w:val="0"/>
+        </w:rPr>
+        <w:t xml:space="preserve">The floating voice control icon stays attached across all screens and follows the user interface during navigation and scrolling. This makes sure that voice interaction is always available without requiring the user to manually open a specific feature tab.</w:t>
+      </w:r>
+    </w:p>
+    <w:p>
+      <w:pPr>
+        <w:keepNext w:val="1"/>
+        <w:spacing w:after="240" w:before="240" w:lineRule="auto"/>
+        <w:rPr/>
+      </w:pPr>
+      <w:r>
+        <w:rPr>
+          <w:rtl w:val="0"/>
+        </w:rPr>
+      </w:r>
+    </w:p>
+    <w:p>
+      <w:pPr>
+        <w:keepNext w:val="1"/>
+        <w:numPr>
+          <w:ilvl w:val="0"/>
+          <w:numId w:val="6"/>
+        </w:numPr>
+        <w:spacing w:after="240" w:before="240" w:lineRule="auto"/>
+        <w:ind w:left="720" w:hanging="360"/>
+        <w:rPr>
+          <w:u w:val="none"/>
+        </w:rPr>
+      </w:pPr>
+      <w:r>
+        <w:rPr>
+          <w:rtl w:val="0"/>
+        </w:rPr>
+        <w:t xml:space="preserve">I</w:t>
+      </w:r>
+      <w:r>
+        <w:rPr>
+          <w:b w:val="1"/>
+          <w:bCs w:val="1"/>
+          <w:rtl w:val="0"/>
+        </w:rPr>
+        <w:t xml:space="preserve">mplementation</w:t>
+      </w:r>
+      <w:r>
+        <w:rPr>
+          <w:rtl w:val="0"/>
+        </w:rPr>
+      </w:r>
+    </w:p>
+    <w:p>
+      <w:pPr>
+        <w:keepNext w:val="1"/>
+        <w:spacing w:after="240" w:before="240" w:lineRule="auto"/>
+        <w:rPr/>
+      </w:pPr>
+      <w:r>
+        <w:rPr>
+          <w:rtl w:val="0"/>
+        </w:rPr>
+        <w:t xml:space="preserve">The floating component is implemented at the application root level so that it remains active regardless of the currently displayed screen. The icon maintains a fixed overlay position above the main interface while allowing the user to continue interacting with the rest of the application.</w:t>
+      </w:r>
+    </w:p>
+    <w:p>
+      <w:pPr>
+        <w:keepNext w:val="1"/>
+        <w:spacing w:after="240" w:before="240" w:lineRule="auto"/>
+        <w:rPr/>
+      </w:pPr>
+      <w:r>
+        <w:rPr>
+          <w:rtl w:val="0"/>
+        </w:rPr>
+      </w:r>
+    </w:p>
+    <w:p>
+      <w:pPr>
+        <w:keepNext w:val="1"/>
+        <w:numPr>
+          <w:ilvl w:val="0"/>
+          <w:numId w:val="4"/>
+        </w:numPr>
+        <w:spacing w:after="240" w:before="240" w:lineRule="auto"/>
+        <w:ind w:left="720" w:hanging="360"/>
+        <w:rPr>
+          <w:b w:val="1"/>
+          <w:bCs w:val="1"/>
+        </w:rPr>
+      </w:pPr>
+      <w:r>
+        <w:rPr>
+          <w:b w:val="1"/>
+          <w:bCs w:val="1"/>
+          <w:rtl w:val="0"/>
+        </w:rPr>
+        <w:t xml:space="preserve">Interaction Flow</w:t>
+      </w:r>
+      <w:r>
+        <w:rPr>
+          <w:rtl w:val="0"/>
+        </w:rPr>
+      </w:r>
+    </w:p>
+    <w:p>
+      <w:pPr>
+        <w:keepNext w:val="1"/>
+        <w:spacing w:after="240" w:before="240" w:lineRule="auto"/>
+        <w:rPr/>
+      </w:pPr>
+      <w:r>
+        <w:rPr>
+          <w:rtl w:val="0"/>
+        </w:rPr>
+        <w:t xml:space="preserve">1. The user activates the floating microphone icon.</w:t>
+      </w:r>
+    </w:p>
+    <w:p>
+      <w:pPr>
+        <w:keepNext w:val="1"/>
+        <w:spacing w:after="240" w:before="240" w:lineRule="auto"/>
+        <w:rPr/>
+      </w:pPr>
+      <w:r>
+        <w:rPr>
+          <w:rtl w:val="0"/>
+        </w:rPr>
+        <w:t xml:space="preserve">2. The application captures spoken input using the speech recognition module.</w:t>
+      </w:r>
+    </w:p>
+    <w:p>
+      <w:pPr>
+        <w:keepNext w:val="1"/>
+        <w:spacing w:after="240" w:before="240" w:lineRule="auto"/>
+        <w:rPr/>
+      </w:pPr>
+      <w:r>
+        <w:rPr>
+          <w:rtl w:val="0"/>
+        </w:rPr>
+        <w:t xml:space="preserve">3. The speech input is converted into text commands.</w:t>
+      </w:r>
+    </w:p>
+    <w:p>
+      <w:pPr>
+        <w:keepNext w:val="1"/>
+        <w:spacing w:after="240" w:before="240" w:lineRule="auto"/>
+        <w:rPr/>
+      </w:pPr>
+      <w:r>
+        <w:rPr>
+          <w:rtl w:val="0"/>
+        </w:rPr>
+        <w:t xml:space="preserve">4. The system interprets the command and triggers the corresponding UI interaction.</w:t>
+      </w:r>
+    </w:p>
+    <w:p>
+      <w:pPr>
+        <w:keepNext w:val="1"/>
+        <w:spacing w:after="240" w:before="240" w:lineRule="auto"/>
+        <w:rPr/>
+      </w:pPr>
+      <w:r>
+        <w:rPr>
+          <w:rtl w:val="0"/>
+        </w:rPr>
+      </w:r>
+    </w:p>
+    <w:p>
+      <w:pPr>
+        <w:keepNext w:val="1"/>
+        <w:numPr>
+          <w:ilvl w:val="0"/>
+          <w:numId w:val="10"/>
+        </w:numPr>
+        <w:spacing w:after="240" w:before="240" w:lineRule="auto"/>
+        <w:ind w:left="720" w:hanging="360"/>
+        <w:rPr>
+          <w:b w:val="1"/>
+          <w:bCs w:val="1"/>
+          <w:u w:val="none"/>
+        </w:rPr>
+      </w:pPr>
+      <w:r>
+        <w:rPr>
+          <w:b w:val="1"/>
+          <w:bCs w:val="1"/>
+          <w:rtl w:val="0"/>
+        </w:rPr>
+        <w:t xml:space="preserve">UI Control Integration</w:t>
+      </w:r>
+      <w:r>
+        <w:rPr>
+          <w:rtl w:val="0"/>
+        </w:rPr>
+      </w:r>
+    </w:p>
+    <w:p>
+      <w:pPr>
+        <w:keepNext w:val="1"/>
+        <w:spacing w:after="240" w:before="240" w:lineRule="auto"/>
+        <w:rPr/>
+      </w:pPr>
+      <w:r>
+        <w:rPr>
+          <w:rtl w:val="0"/>
+        </w:rPr>
+        <w:t xml:space="preserve">The speech recognition system is connected to existing interface controls including:</w:t>
+      </w:r>
+    </w:p>
+    <w:p>
+      <w:pPr>
+        <w:keepNext w:val="1"/>
+        <w:spacing w:after="240" w:before="240" w:lineRule="auto"/>
+        <w:rPr/>
+      </w:pPr>
+      <w:r>
+        <w:rPr>
+          <w:rtl w:val="0"/>
+        </w:rPr>
+        <w:t xml:space="preserve">• Door control buttons  </w:t>
+      </w:r>
+    </w:p>
+    <w:p>
+      <w:pPr>
+        <w:keepNext w:val="1"/>
+        <w:spacing w:after="240" w:before="240" w:lineRule="auto"/>
+        <w:rPr/>
+      </w:pPr>
+      <w:r>
+        <w:rPr>
+          <w:rtl w:val="0"/>
+        </w:rPr>
+        <w:t xml:space="preserve">• Window control buttons  </w:t>
+      </w:r>
+    </w:p>
+    <w:p>
+      <w:pPr>
+        <w:keepNext w:val="1"/>
+        <w:spacing w:after="240" w:before="240" w:lineRule="auto"/>
+        <w:rPr/>
+      </w:pPr>
+      <w:r>
+        <w:rPr>
+          <w:rtl w:val="0"/>
+        </w:rPr>
+        <w:t xml:space="preserve">• Ventilation and device toggles  </w:t>
+      </w:r>
+    </w:p>
+    <w:p>
+      <w:pPr>
+        <w:keepNext w:val="1"/>
+        <w:spacing w:after="240" w:before="240" w:lineRule="auto"/>
+        <w:rPr/>
+      </w:pPr>
+      <w:r>
+        <w:rPr>
+          <w:rtl w:val="0"/>
+        </w:rPr>
+        <w:t xml:space="preserve">• Sliders and adjustable controls</w:t>
+      </w:r>
+    </w:p>
+    <w:p>
+      <w:pPr>
+        <w:keepNext w:val="1"/>
+        <w:spacing w:after="240" w:before="240" w:lineRule="auto"/>
+        <w:rPr/>
+      </w:pPr>
+      <w:r>
+        <w:rPr>
+          <w:rtl w:val="0"/>
+        </w:rPr>
+        <w:t xml:space="preserve">Voice commands trigger the same underlying functions used by the UI controls. This ensures consistent behavior between manual interaction and speech-based interaction.</w:t>
+      </w:r>
+    </w:p>
+    <w:p>
+      <w:pPr>
+        <w:keepNext w:val="1"/>
+        <w:spacing w:after="240" w:before="240" w:lineRule="auto"/>
+        <w:rPr/>
+      </w:pPr>
+      <w:r>
+        <w:rPr>
+          <w:rtl w:val="0"/>
+        </w:rPr>
+      </w:r>
+    </w:p>
+    <w:p>
+      <w:pPr>
+        <w:keepNext w:val="1"/>
+        <w:spacing w:after="240" w:before="240" w:lineRule="auto"/>
+        <w:rPr/>
+      </w:pPr>
+      <w:r>
+        <w:rPr>
+          <w:rtl w:val="0"/>
+        </w:rPr>
+      </w:r>
+    </w:p>
+    <w:p>
+      <w:pPr>
+        <w:keepNext w:val="1"/>
+        <w:spacing w:after="240" w:before="240" w:lineRule="auto"/>
+        <w:rPr/>
+      </w:pPr>
+      <w:r>
+        <w:rPr>
+          <w:b w:val="1"/>
+          <w:bCs w:val="1"/>
+          <w:rtl w:val="0"/>
+        </w:rPr>
+        <w:t xml:space="preserve">D6 – Web application testing strategy for device-control integration</w:t>
+        <w:br w:type="textWrapping"/>
+      </w:r>
+      <w:r>
+        <w:rPr>
+          <w:rtl w:val="0"/>
+        </w:rPr>
+        <w:t xml:space="preserve"> This design item describes how the web application will be verified during the current sprint. The testing focus is the interaction path between the web user interface, Firebase Authentication, Firestore, and the device state representation used by the project.</w:t>
+      </w:r>
+    </w:p>
+    <w:p>
+      <w:pPr>
+        <w:keepNext w:val="1"/>
+        <w:spacing w:after="240" w:before="240" w:lineRule="auto"/>
+        <w:rPr/>
+      </w:pPr>
+      <w:r>
+        <w:rPr>
+          <w:rtl w:val="0"/>
+        </w:rPr>
+        <w:t xml:space="preserve">The verification strategy includes:</w:t>
+      </w:r>
+    </w:p>
+    <w:p>
+      <w:pPr>
+        <w:keepNext w:val="1"/>
+        <w:numPr>
+          <w:ilvl w:val="0"/>
+          <w:numId w:val="9"/>
+        </w:numPr>
+        <w:spacing w:after="0" w:afterAutospacing="0" w:before="240" w:lineRule="auto"/>
+        <w:ind w:left="720" w:hanging="360"/>
+      </w:pPr>
+      <w:r>
+        <w:rPr>
+          <w:rtl w:val="0"/>
+        </w:rPr>
+        <w:t xml:space="preserve">manual testing of login and signup validation</w:t>
+        <w:br w:type="textWrapping"/>
+      </w:r>
+    </w:p>
+    <w:p>
+      <w:pPr>
+        <w:keepNext w:val="1"/>
+        <w:numPr>
+          <w:ilvl w:val="0"/>
+          <w:numId w:val="9"/>
+        </w:numPr>
+        <w:spacing w:after="0" w:afterAutospacing="0" w:before="0" w:beforeAutospacing="0" w:lineRule="auto"/>
+        <w:ind w:left="720" w:hanging="360"/>
+      </w:pPr>
+      <w:r>
+        <w:rPr>
+          <w:rtl w:val="0"/>
+        </w:rPr>
+        <w:t xml:space="preserve">manual testing of navigation and guest access</w:t>
+        <w:br w:type="textWrapping"/>
+      </w:r>
+    </w:p>
+    <w:p>
+      <w:pPr>
+        <w:keepNext w:val="1"/>
+        <w:numPr>
+          <w:ilvl w:val="0"/>
+          <w:numId w:val="9"/>
+        </w:numPr>
+        <w:spacing w:after="0" w:afterAutospacing="0" w:before="0" w:beforeAutospacing="0" w:lineRule="auto"/>
+        <w:ind w:left="720" w:hanging="360"/>
+      </w:pPr>
+      <w:r>
+        <w:rPr>
+          <w:rtl w:val="0"/>
+        </w:rPr>
+        <w:t xml:space="preserve">verification of Firestore-backed device toggles</w:t>
+        <w:br w:type="textWrapping"/>
+      </w:r>
+    </w:p>
+    <w:p>
+      <w:pPr>
+        <w:keepNext w:val="1"/>
+        <w:numPr>
+          <w:ilvl w:val="0"/>
+          <w:numId w:val="9"/>
+        </w:numPr>
+        <w:spacing w:after="0" w:afterAutospacing="0" w:before="0" w:beforeAutospacing="0" w:lineRule="auto"/>
+        <w:ind w:left="720" w:hanging="360"/>
+      </w:pPr>
+      <w:r>
+        <w:rPr>
+          <w:rtl w:val="0"/>
+        </w:rPr>
+        <w:t xml:space="preserve">verification of real-time synchronization through snapshot updates</w:t>
+        <w:br w:type="textWrapping"/>
+      </w:r>
+    </w:p>
+    <w:p>
+      <w:pPr>
+        <w:keepNext w:val="1"/>
+        <w:numPr>
+          <w:ilvl w:val="0"/>
+          <w:numId w:val="9"/>
+        </w:numPr>
+        <w:spacing w:after="240" w:before="0" w:beforeAutospacing="0" w:lineRule="auto"/>
+        <w:ind w:left="720" w:hanging="360"/>
+      </w:pPr>
+      <w:r>
+        <w:rPr>
+          <w:rtl w:val="0"/>
+        </w:rPr>
+        <w:t xml:space="preserve">defect logging and retesting after fixes</w:t>
+        <w:br w:type="textWrapping"/>
+      </w:r>
+    </w:p>
+    <w:p>
+      <w:pPr>
+        <w:keepNext w:val="1"/>
+        <w:spacing w:after="240" w:before="240" w:lineRule="auto"/>
+        <w:rPr/>
+      </w:pPr>
+      <w:r>
+        <w:rPr>
+          <w:rtl w:val="0"/>
+        </w:rPr>
+        <w:t xml:space="preserve">This strategy supports reliable integration between subgroup components and reduces the risk of hidden faults in the device-control workflow.</w:t>
+      </w:r>
+    </w:p>
+    <w:p>
+      <w:pPr>
+        <w:keepNext w:val="1"/>
+        <w:spacing w:after="60" w:before="240" w:lineRule="auto"/>
+        <w:rPr/>
+      </w:pPr>
+      <w:r>
+        <w:rPr>
+          <w:rtl w:val="0"/>
+        </w:rPr>
+      </w:r>
+    </w:p>
+    <w:p>
+      <w:pPr>
+        <w:rPr/>
+      </w:pPr>
+      <w:r>
+        <w:rPr>
+          <w:rtl w:val="0"/>
+        </w:rPr>
       </w:r>
     </w:p>
     <w:p>
@@ -4841,347 +5777,6 @@
     <w:p>
       <w:pPr>
         <w:keepNext w:val="1"/>
-        <w:spacing w:after="240" w:before="240" w:lineRule="auto"/>
-        <w:rPr>
-          <w:b w:val="1"/>
-          <w:bCs w:val="1"/>
-          <w:sz w:val="32"/>
-          <w:szCs w:val="32"/>
-        </w:rPr>
-      </w:pPr>
-      <w:r>
-        <w:rPr>
-          <w:b w:val="1"/>
-          <w:bCs w:val="1"/>
-          <w:sz w:val="32"/>
-          <w:szCs w:val="32"/>
-          <w:rtl w:val="0"/>
-        </w:rPr>
-        <w:t xml:space="preserve">D6 – Speech Recognition Integration and Voice Navigation Design</w:t>
-      </w:r>
-    </w:p>
-    <w:p>
-      <w:pPr>
-        <w:keepNext w:val="1"/>
-        <w:spacing w:after="240" w:before="240" w:lineRule="auto"/>
-        <w:rPr/>
-      </w:pPr>
-      <w:r>
-        <w:rPr>
-          <w:rtl w:val="0"/>
-        </w:rPr>
-      </w:r>
-    </w:p>
-    <w:p>
-      <w:pPr>
-        <w:keepNext w:val="1"/>
-        <w:numPr>
-          <w:ilvl w:val="0"/>
-          <w:numId w:val="4"/>
-        </w:numPr>
-        <w:spacing w:after="240" w:before="240" w:lineRule="auto"/>
-        <w:ind w:left="720" w:hanging="360"/>
-        <w:rPr>
-          <w:b w:val="1"/>
-          <w:bCs w:val="1"/>
-        </w:rPr>
-      </w:pPr>
-      <w:r>
-        <w:rPr>
-          <w:b w:val="1"/>
-          <w:bCs w:val="1"/>
-          <w:rtl w:val="0"/>
-        </w:rPr>
-        <w:t xml:space="preserve">Description</w:t>
-      </w:r>
-    </w:p>
-    <w:p>
-      <w:pPr>
-        <w:keepNext w:val="1"/>
-        <w:spacing w:after="240" w:before="240" w:lineRule="auto"/>
-        <w:rPr/>
-      </w:pPr>
-      <w:r>
-        <w:rPr>
-          <w:rtl w:val="0"/>
-        </w:rPr>
-        <w:t xml:space="preserve">This design item describes the integration of speech recognition into the mobile application using Expo and an external speech recognition library. The feature allows users to control the Interactive House system using spoken commands instead of manual text input.</w:t>
-      </w:r>
-    </w:p>
-    <w:p>
-      <w:pPr>
-        <w:keepNext w:val="1"/>
-        <w:numPr>
-          <w:ilvl w:val="0"/>
-          <w:numId w:val="7"/>
-        </w:numPr>
-        <w:spacing w:after="240" w:before="240" w:lineRule="auto"/>
-        <w:ind w:left="720" w:hanging="360"/>
-        <w:rPr>
-          <w:b w:val="1"/>
-          <w:bCs w:val="1"/>
-        </w:rPr>
-      </w:pPr>
-      <w:r>
-        <w:rPr>
-          <w:b w:val="1"/>
-          <w:bCs w:val="1"/>
-          <w:rtl w:val="0"/>
-        </w:rPr>
-        <w:t xml:space="preserve">Technology and Build Configuration</w:t>
-      </w:r>
-    </w:p>
-    <w:p>
-      <w:pPr>
-        <w:keepNext w:val="1"/>
-        <w:spacing w:after="240" w:before="240" w:lineRule="auto"/>
-        <w:rPr/>
-      </w:pPr>
-      <w:r>
-        <w:rPr>
-          <w:rtl w:val="0"/>
-        </w:rPr>
-        <w:t xml:space="preserve">The speech recognition functionality requires native device capabilities that are not available in the standard Expo Go environment. Therefore, a custom Expo development build was created to support the external speech recognition library and enable microphone access and real-time voice processing.</w:t>
-      </w:r>
-    </w:p>
-    <w:p>
-      <w:pPr>
-        <w:keepNext w:val="1"/>
-        <w:numPr>
-          <w:ilvl w:val="0"/>
-          <w:numId w:val="3"/>
-        </w:numPr>
-        <w:spacing w:after="240" w:before="240" w:lineRule="auto"/>
-        <w:ind w:left="720" w:hanging="360"/>
-        <w:rPr>
-          <w:b w:val="1"/>
-          <w:bCs w:val="1"/>
-        </w:rPr>
-      </w:pPr>
-      <w:r>
-        <w:rPr>
-          <w:b w:val="1"/>
-          <w:bCs w:val="1"/>
-          <w:rtl w:val="0"/>
-        </w:rPr>
-        <w:t xml:space="preserve">Architecture Integration</w:t>
-      </w:r>
-    </w:p>
-    <w:p>
-      <w:pPr>
-        <w:keepNext w:val="1"/>
-        <w:spacing w:after="240" w:before="240" w:lineRule="auto"/>
-        <w:rPr/>
-      </w:pPr>
-      <w:r>
-        <w:rPr>
-          <w:rtl w:val="0"/>
-        </w:rPr>
-        <w:t xml:space="preserve">The speech recognition module is implemented as a dedicated screen (tab) within the mobile application. The module interacts with the existing navigation and AI chat system.</w:t>
-      </w:r>
-    </w:p>
-    <w:p>
-      <w:pPr>
-        <w:keepNext w:val="1"/>
-        <w:spacing w:after="240" w:before="240" w:lineRule="auto"/>
-        <w:rPr/>
-      </w:pPr>
-      <w:r>
-        <w:rPr>
-          <w:rtl w:val="0"/>
-        </w:rPr>
-      </w:r>
-    </w:p>
-    <w:p>
-      <w:pPr>
-        <w:keepNext w:val="1"/>
-        <w:spacing w:after="240" w:before="240" w:lineRule="auto"/>
-        <w:rPr/>
-      </w:pPr>
-      <w:r>
-        <w:rPr>
-          <w:rtl w:val="0"/>
-        </w:rPr>
-        <w:t xml:space="preserve">The interaction flow is:</w:t>
-      </w:r>
-    </w:p>
-    <w:p>
-      <w:pPr>
-        <w:keepNext w:val="1"/>
-        <w:spacing w:after="240" w:before="240" w:lineRule="auto"/>
-        <w:rPr/>
-      </w:pPr>
-      <w:r>
-        <w:rPr>
-          <w:rtl w:val="0"/>
-        </w:rPr>
-        <w:t xml:space="preserve">1. The user opens the Speech Recognition tab.</w:t>
-      </w:r>
-    </w:p>
-    <w:p>
-      <w:pPr>
-        <w:keepNext w:val="1"/>
-        <w:spacing w:after="240" w:before="240" w:lineRule="auto"/>
-        <w:rPr/>
-      </w:pPr>
-      <w:r>
-        <w:rPr>
-          <w:rtl w:val="0"/>
-        </w:rPr>
-        <w:t xml:space="preserve">2. The user activates the microphone using the UI control.</w:t>
-      </w:r>
-    </w:p>
-    <w:p>
-      <w:pPr>
-        <w:keepNext w:val="1"/>
-        <w:spacing w:after="240" w:before="240" w:lineRule="auto"/>
-        <w:rPr/>
-      </w:pPr>
-      <w:r>
-        <w:rPr>
-          <w:rtl w:val="0"/>
-        </w:rPr>
-        <w:t xml:space="preserve">3. Spoken input is captured and converted into text using the speech recognition library.</w:t>
-      </w:r>
-    </w:p>
-    <w:p>
-      <w:pPr>
-        <w:keepNext w:val="1"/>
-        <w:spacing w:after="240" w:before="240" w:lineRule="auto"/>
-        <w:rPr/>
-      </w:pPr>
-      <w:r>
-        <w:rPr>
-          <w:rtl w:val="0"/>
-        </w:rPr>
-        <w:t xml:space="preserve">4. The recognized text is displayed and forwarded to the backend AI API. (Future feature)</w:t>
-      </w:r>
-    </w:p>
-    <w:p>
-      <w:pPr>
-        <w:keepNext w:val="1"/>
-        <w:spacing w:after="240" w:before="240" w:lineRule="auto"/>
-        <w:rPr/>
-      </w:pPr>
-      <w:r>
-        <w:rPr>
-          <w:rtl w:val="0"/>
-        </w:rPr>
-        <w:t xml:space="preserve">5. The backend processes the command and returns a response.(Future feature)</w:t>
-      </w:r>
-    </w:p>
-    <w:p>
-      <w:pPr>
-        <w:keepNext w:val="1"/>
-        <w:spacing w:after="240" w:before="240" w:lineRule="auto"/>
-        <w:rPr/>
-      </w:pPr>
-      <w:r>
-        <w:rPr>
-          <w:rtl w:val="0"/>
-        </w:rPr>
-        <w:t xml:space="preserve">The application navigates to the relevant screen or updates the system state based on the interpreted command. </w:t>
-      </w:r>
-    </w:p>
-    <w:p>
-      <w:pPr>
-        <w:keepNext w:val="1"/>
-        <w:numPr>
-          <w:ilvl w:val="0"/>
-          <w:numId w:val="1"/>
-        </w:numPr>
-        <w:spacing w:after="240" w:before="240" w:lineRule="auto"/>
-        <w:ind w:left="720" w:hanging="360"/>
-        <w:rPr>
-          <w:b w:val="1"/>
-          <w:bCs w:val="1"/>
-        </w:rPr>
-      </w:pPr>
-      <w:r>
-        <w:rPr>
-          <w:b w:val="1"/>
-          <w:bCs w:val="1"/>
-          <w:rtl w:val="0"/>
-        </w:rPr>
-        <w:t xml:space="preserve">Navigation Integration</w:t>
-      </w:r>
-    </w:p>
-    <w:p>
-      <w:pPr>
-        <w:keepNext w:val="1"/>
-        <w:spacing w:after="240" w:before="240" w:lineRule="auto"/>
-        <w:rPr/>
-      </w:pPr>
-      <w:r>
-        <w:rPr>
-          <w:rtl w:val="0"/>
-        </w:rPr>
-        <w:t xml:space="preserve">Speech recognition can trigger navigation between different screens in the application. This allows users to move between system features using voice commands, improving accessibility and interaction efficiency.</w:t>
-      </w:r>
-    </w:p>
-    <w:p>
-      <w:pPr>
-        <w:keepNext w:val="1"/>
-        <w:numPr>
-          <w:ilvl w:val="0"/>
-          <w:numId w:val="11"/>
-        </w:numPr>
-        <w:spacing w:after="240" w:before="240" w:lineRule="auto"/>
-        <w:ind w:left="720" w:hanging="360"/>
-        <w:rPr>
-          <w:b w:val="1"/>
-          <w:bCs w:val="1"/>
-        </w:rPr>
-      </w:pPr>
-      <w:r>
-        <w:rPr>
-          <w:b w:val="1"/>
-          <w:bCs w:val="1"/>
-          <w:rtl w:val="0"/>
-        </w:rPr>
-        <w:t xml:space="preserve">Future Extension – Floating Voice Control Module</w:t>
-      </w:r>
-    </w:p>
-    <w:p>
-      <w:pPr>
-        <w:keepNext w:val="1"/>
-        <w:spacing w:after="240" w:before="240" w:lineRule="auto"/>
-        <w:rPr/>
-      </w:pPr>
-      <w:r>
-        <w:rPr>
-          <w:rtl w:val="0"/>
-        </w:rPr>
-        <w:t xml:space="preserve">The system architecture is designed to support a future floating voice control component. This component will allow speech interaction from any screen without requiring the user to manually open the speech tab. The floating module will act as a global input interface integrated with the existing AI backend and navigation system.</w:t>
-      </w:r>
-    </w:p>
-    <w:p>
-      <w:pPr>
-        <w:keepNext w:val="1"/>
-        <w:spacing w:after="240" w:before="240" w:lineRule="auto"/>
-        <w:rPr/>
-      </w:pPr>
-      <w:r>
-        <w:rPr>
-          <w:rtl w:val="0"/>
-        </w:rPr>
-      </w:r>
-    </w:p>
-    <w:p>
-      <w:pPr>
-        <w:keepNext w:val="1"/>
-        <w:spacing w:after="240" w:before="240" w:lineRule="auto"/>
-        <w:rPr/>
-      </w:pPr>
-      <w:r>
-        <w:rPr>
-          <w:rtl w:val="0"/>
-        </w:rPr>
-      </w:r>
-    </w:p>
-    <w:p>
-      <w:pPr>
-        <w:keepNext w:val="1"/>
         <w:keepLines w:val="0"/>
         <w:pageBreakBefore w:val="0"/>
         <w:widowControl w:val="1"/>
@@ -5404,33 +5999,8 @@
         </w:rPr>
       </w:r>
     </w:p>
-    <w:p>
-      <w:pPr>
-        <w:keepNext w:val="1"/>
-        <w:keepLines w:val="0"/>
-        <w:pageBreakBefore w:val="0"/>
-        <w:widowControl w:val="1"/>
-        <w:pBdr>
-          <w:top w:space="0" w:sz="0" w:val="nil"/>
-          <w:left w:space="0" w:sz="0" w:val="nil"/>
-          <w:bottom w:space="0" w:sz="0" w:val="nil"/>
-          <w:right w:space="0" w:sz="0" w:val="nil"/>
-          <w:between w:space="0" w:sz="0" w:val="nil"/>
-        </w:pBdr>
-        <w:shd w:fill="auto" w:val="clear"/>
-        <w:spacing w:after="60" w:before="240" w:line="240" w:lineRule="auto"/>
-        <w:ind w:left="0" w:right="0" w:firstLine="0"/>
-        <w:jc w:val="left"/>
-        <w:rPr/>
-      </w:pPr>
-      <w:r>
-        <w:rPr>
-          <w:rtl w:val="0"/>
-        </w:rPr>
-      </w:r>
-    </w:p>
     <w:sectPr>
-      <w:headerReference r:id="rId10" w:type="default"/>
+      <w:headerReference r:id="rId11" w:type="default"/>
       <w:pgSz w:h="16838" w:w="11906" w:orient="portrait"/>
       <w:pgMar w:bottom="1417" w:top="1417" w:left="1417" w:right="1417" w:header="708" w:footer="708"/>
       <w:pgNumType w:start="1"/>
@@ -5899,8 +6469,8 @@
   <w:abstractNum w:abstractNumId="5">
     <w:lvl w:ilvl="0">
       <w:start w:val="1"/>
-      <w:numFmt w:val="decimal"/>
-      <w:lvlText w:val="%1."/>
+      <w:numFmt w:val="bullet"/>
+      <w:lvlText w:val="-"/>
       <w:lvlJc w:val="left"/>
       <w:pPr>
         <w:ind w:left="720" w:hanging="360"/>
@@ -5911,8 +6481,8 @@
     </w:lvl>
     <w:lvl w:ilvl="1">
       <w:start w:val="1"/>
-      <w:numFmt w:val="lowerLetter"/>
-      <w:lvlText w:val="%2."/>
+      <w:numFmt w:val="bullet"/>
+      <w:lvlText w:val="-"/>
       <w:lvlJc w:val="left"/>
       <w:pPr>
         <w:ind w:left="1440" w:hanging="360"/>
@@ -5923,8 +6493,8 @@
     </w:lvl>
     <w:lvl w:ilvl="2">
       <w:start w:val="1"/>
-      <w:numFmt w:val="lowerRoman"/>
-      <w:lvlText w:val="%3."/>
+      <w:numFmt w:val="bullet"/>
+      <w:lvlText w:val="-"/>
       <w:lvlJc w:val="left"/>
       <w:pPr>
         <w:ind w:left="2160" w:hanging="360"/>
@@ -5935,8 +6505,8 @@
     </w:lvl>
     <w:lvl w:ilvl="3">
       <w:start w:val="1"/>
-      <w:numFmt w:val="decimal"/>
-      <w:lvlText w:val="%4."/>
+      <w:numFmt w:val="bullet"/>
+      <w:lvlText w:val="-"/>
       <w:lvlJc w:val="left"/>
       <w:pPr>
         <w:ind w:left="2880" w:hanging="360"/>
@@ -5947,8 +6517,8 @@
     </w:lvl>
     <w:lvl w:ilvl="4">
       <w:start w:val="1"/>
-      <w:numFmt w:val="lowerLetter"/>
-      <w:lvlText w:val="%5."/>
+      <w:numFmt w:val="bullet"/>
+      <w:lvlText w:val="-"/>
       <w:lvlJc w:val="left"/>
       <w:pPr>
         <w:ind w:left="3600" w:hanging="360"/>
@@ -5959,8 +6529,8 @@
     </w:lvl>
     <w:lvl w:ilvl="5">
       <w:start w:val="1"/>
-      <w:numFmt w:val="lowerRoman"/>
-      <w:lvlText w:val="%6."/>
+      <w:numFmt w:val="bullet"/>
+      <w:lvlText w:val="-"/>
       <w:lvlJc w:val="left"/>
       <w:pPr>
         <w:ind w:left="4320" w:hanging="360"/>
@@ -5971,8 +6541,8 @@
     </w:lvl>
     <w:lvl w:ilvl="6">
       <w:start w:val="1"/>
-      <w:numFmt w:val="decimal"/>
-      <w:lvlText w:val="%7."/>
+      <w:numFmt w:val="bullet"/>
+      <w:lvlText w:val="-"/>
       <w:lvlJc w:val="left"/>
       <w:pPr>
         <w:ind w:left="5040" w:hanging="360"/>
@@ -5983,8 +6553,8 @@
     </w:lvl>
     <w:lvl w:ilvl="7">
       <w:start w:val="1"/>
-      <w:numFmt w:val="lowerLetter"/>
-      <w:lvlText w:val="%8."/>
+      <w:numFmt w:val="bullet"/>
+      <w:lvlText w:val="-"/>
       <w:lvlJc w:val="left"/>
       <w:pPr>
         <w:ind w:left="5760" w:hanging="360"/>
@@ -5995,8 +6565,8 @@
     </w:lvl>
     <w:lvl w:ilvl="8">
       <w:start w:val="1"/>
-      <w:numFmt w:val="lowerRoman"/>
-      <w:lvlText w:val="%9."/>
+      <w:numFmt w:val="bullet"/>
+      <w:lvlText w:val="-"/>
       <w:lvlJc w:val="left"/>
       <w:pPr>
         <w:ind w:left="6480" w:hanging="360"/>
@@ -6010,7 +6580,7 @@
     <w:lvl w:ilvl="0">
       <w:start w:val="1"/>
       <w:numFmt w:val="bullet"/>
-      <w:lvlText w:val="●"/>
+      <w:lvlText w:val="-"/>
       <w:lvlJc w:val="left"/>
       <w:pPr>
         <w:ind w:left="720" w:hanging="360"/>
@@ -6022,7 +6592,7 @@
     <w:lvl w:ilvl="1">
       <w:start w:val="1"/>
       <w:numFmt w:val="bullet"/>
-      <w:lvlText w:val="○"/>
+      <w:lvlText w:val="-"/>
       <w:lvlJc w:val="left"/>
       <w:pPr>
         <w:ind w:left="1440" w:hanging="360"/>
@@ -6034,7 +6604,7 @@
     <w:lvl w:ilvl="2">
       <w:start w:val="1"/>
       <w:numFmt w:val="bullet"/>
-      <w:lvlText w:val="■"/>
+      <w:lvlText w:val="-"/>
       <w:lvlJc w:val="left"/>
       <w:pPr>
         <w:ind w:left="2160" w:hanging="360"/>
@@ -6046,7 +6616,7 @@
     <w:lvl w:ilvl="3">
       <w:start w:val="1"/>
       <w:numFmt w:val="bullet"/>
-      <w:lvlText w:val="●"/>
+      <w:lvlText w:val="-"/>
       <w:lvlJc w:val="left"/>
       <w:pPr>
         <w:ind w:left="2880" w:hanging="360"/>
@@ -6058,7 +6628,7 @@
     <w:lvl w:ilvl="4">
       <w:start w:val="1"/>
       <w:numFmt w:val="bullet"/>
-      <w:lvlText w:val="○"/>
+      <w:lvlText w:val="-"/>
       <w:lvlJc w:val="left"/>
       <w:pPr>
         <w:ind w:left="3600" w:hanging="360"/>
@@ -6070,7 +6640,7 @@
     <w:lvl w:ilvl="5">
       <w:start w:val="1"/>
       <w:numFmt w:val="bullet"/>
-      <w:lvlText w:val="■"/>
+      <w:lvlText w:val="-"/>
       <w:lvlJc w:val="left"/>
       <w:pPr>
         <w:ind w:left="4320" w:hanging="360"/>
@@ -6082,7 +6652,7 @@
     <w:lvl w:ilvl="6">
       <w:start w:val="1"/>
       <w:numFmt w:val="bullet"/>
-      <w:lvlText w:val="●"/>
+      <w:lvlText w:val="-"/>
       <w:lvlJc w:val="left"/>
       <w:pPr>
         <w:ind w:left="5040" w:hanging="360"/>
@@ -6094,7 +6664,7 @@
     <w:lvl w:ilvl="7">
       <w:start w:val="1"/>
       <w:numFmt w:val="bullet"/>
-      <w:lvlText w:val="○"/>
+      <w:lvlText w:val="-"/>
       <w:lvlJc w:val="left"/>
       <w:pPr>
         <w:ind w:left="5760" w:hanging="360"/>
@@ -6106,7 +6676,7 @@
     <w:lvl w:ilvl="8">
       <w:start w:val="1"/>
       <w:numFmt w:val="bullet"/>
-      <w:lvlText w:val="■"/>
+      <w:lvlText w:val="-"/>
       <w:lvlJc w:val="left"/>
       <w:pPr>
         <w:ind w:left="6480" w:hanging="360"/>
@@ -6450,7 +7020,7 @@
     <w:lvl w:ilvl="0">
       <w:start w:val="1"/>
       <w:numFmt w:val="bullet"/>
-      <w:lvlText w:val="●"/>
+      <w:lvlText w:val="-"/>
       <w:lvlJc w:val="left"/>
       <w:pPr>
         <w:ind w:left="720" w:hanging="360"/>
@@ -6462,7 +7032,7 @@
     <w:lvl w:ilvl="1">
       <w:start w:val="1"/>
       <w:numFmt w:val="bullet"/>
-      <w:lvlText w:val="○"/>
+      <w:lvlText w:val="-"/>
       <w:lvlJc w:val="left"/>
       <w:pPr>
         <w:ind w:left="1440" w:hanging="360"/>
@@ -6474,7 +7044,7 @@
     <w:lvl w:ilvl="2">
       <w:start w:val="1"/>
       <w:numFmt w:val="bullet"/>
-      <w:lvlText w:val="■"/>
+      <w:lvlText w:val="-"/>
       <w:lvlJc w:val="left"/>
       <w:pPr>
         <w:ind w:left="2160" w:hanging="360"/>
@@ -6486,7 +7056,7 @@
     <w:lvl w:ilvl="3">
       <w:start w:val="1"/>
       <w:numFmt w:val="bullet"/>
-      <w:lvlText w:val="●"/>
+      <w:lvlText w:val="-"/>
       <w:lvlJc w:val="left"/>
       <w:pPr>
         <w:ind w:left="2880" w:hanging="360"/>
@@ -6498,7 +7068,7 @@
     <w:lvl w:ilvl="4">
       <w:start w:val="1"/>
       <w:numFmt w:val="bullet"/>
-      <w:lvlText w:val="○"/>
+      <w:lvlText w:val="-"/>
       <w:lvlJc w:val="left"/>
       <w:pPr>
         <w:ind w:left="3600" w:hanging="360"/>
@@ -6510,7 +7080,7 @@
     <w:lvl w:ilvl="5">
       <w:start w:val="1"/>
       <w:numFmt w:val="bullet"/>
-      <w:lvlText w:val="■"/>
+      <w:lvlText w:val="-"/>
       <w:lvlJc w:val="left"/>
       <w:pPr>
         <w:ind w:left="4320" w:hanging="360"/>
@@ -6522,7 +7092,7 @@
     <w:lvl w:ilvl="6">
       <w:start w:val="1"/>
       <w:numFmt w:val="bullet"/>
-      <w:lvlText w:val="●"/>
+      <w:lvlText w:val="-"/>
       <w:lvlJc w:val="left"/>
       <w:pPr>
         <w:ind w:left="5040" w:hanging="360"/>
@@ -6534,7 +7104,7 @@
     <w:lvl w:ilvl="7">
       <w:start w:val="1"/>
       <w:numFmt w:val="bullet"/>
-      <w:lvlText w:val="○"/>
+      <w:lvlText w:val="-"/>
       <w:lvlJc w:val="left"/>
       <w:pPr>
         <w:ind w:left="5760" w:hanging="360"/>
@@ -6546,7 +7116,7 @@
     <w:lvl w:ilvl="8">
       <w:start w:val="1"/>
       <w:numFmt w:val="bullet"/>
-      <w:lvlText w:val="■"/>
+      <w:lvlText w:val="-"/>
       <w:lvlJc w:val="left"/>
       <w:pPr>
         <w:ind w:left="6480" w:hanging="360"/>
@@ -6557,6 +7127,116 @@
     </w:lvl>
   </w:abstractNum>
   <w:abstractNum w:abstractNumId="11">
+    <w:lvl w:ilvl="0">
+      <w:start w:val="1"/>
+      <w:numFmt w:val="bullet"/>
+      <w:lvlText w:val="●"/>
+      <w:lvlJc w:val="left"/>
+      <w:pPr>
+        <w:ind w:left="720" w:hanging="360"/>
+      </w:pPr>
+      <w:rPr>
+        <w:u w:val="none"/>
+      </w:rPr>
+    </w:lvl>
+    <w:lvl w:ilvl="1">
+      <w:start w:val="1"/>
+      <w:numFmt w:val="bullet"/>
+      <w:lvlText w:val="○"/>
+      <w:lvlJc w:val="left"/>
+      <w:pPr>
+        <w:ind w:left="1440" w:hanging="360"/>
+      </w:pPr>
+      <w:rPr>
+        <w:u w:val="none"/>
+      </w:rPr>
+    </w:lvl>
+    <w:lvl w:ilvl="2">
+      <w:start w:val="1"/>
+      <w:numFmt w:val="bullet"/>
+      <w:lvlText w:val="■"/>
+      <w:lvlJc w:val="left"/>
+      <w:pPr>
+        <w:ind w:left="2160" w:hanging="360"/>
+      </w:pPr>
+      <w:rPr>
+        <w:u w:val="none"/>
+      </w:rPr>
+    </w:lvl>
+    <w:lvl w:ilvl="3">
+      <w:start w:val="1"/>
+      <w:numFmt w:val="bullet"/>
+      <w:lvlText w:val="●"/>
+      <w:lvlJc w:val="left"/>
+      <w:pPr>
+        <w:ind w:left="2880" w:hanging="360"/>
+      </w:pPr>
+      <w:rPr>
+        <w:u w:val="none"/>
+      </w:rPr>
+    </w:lvl>
+    <w:lvl w:ilvl="4">
+      <w:start w:val="1"/>
+      <w:numFmt w:val="bullet"/>
+      <w:lvlText w:val="○"/>
+      <w:lvlJc w:val="left"/>
+      <w:pPr>
+        <w:ind w:left="3600" w:hanging="360"/>
+      </w:pPr>
+      <w:rPr>
+        <w:u w:val="none"/>
+      </w:rPr>
+    </w:lvl>
+    <w:lvl w:ilvl="5">
+      <w:start w:val="1"/>
+      <w:numFmt w:val="bullet"/>
+      <w:lvlText w:val="■"/>
+      <w:lvlJc w:val="left"/>
+      <w:pPr>
+        <w:ind w:left="4320" w:hanging="360"/>
+      </w:pPr>
+      <w:rPr>
+        <w:u w:val="none"/>
+      </w:rPr>
+    </w:lvl>
+    <w:lvl w:ilvl="6">
+      <w:start w:val="1"/>
+      <w:numFmt w:val="bullet"/>
+      <w:lvlText w:val="●"/>
+      <w:lvlJc w:val="left"/>
+      <w:pPr>
+        <w:ind w:left="5040" w:hanging="360"/>
+      </w:pPr>
+      <w:rPr>
+        <w:u w:val="none"/>
+      </w:rPr>
+    </w:lvl>
+    <w:lvl w:ilvl="7">
+      <w:start w:val="1"/>
+      <w:numFmt w:val="bullet"/>
+      <w:lvlText w:val="○"/>
+      <w:lvlJc w:val="left"/>
+      <w:pPr>
+        <w:ind w:left="5760" w:hanging="360"/>
+      </w:pPr>
+      <w:rPr>
+        <w:u w:val="none"/>
+      </w:rPr>
+    </w:lvl>
+    <w:lvl w:ilvl="8">
+      <w:start w:val="1"/>
+      <w:numFmt w:val="bullet"/>
+      <w:lvlText w:val="■"/>
+      <w:lvlJc w:val="left"/>
+      <w:pPr>
+        <w:ind w:left="6480" w:hanging="360"/>
+      </w:pPr>
+      <w:rPr>
+        <w:u w:val="none"/>
+      </w:rPr>
+    </w:lvl>
+  </w:abstractNum>
+  <w:abstractNum w:abstractNumId="12">
     <w:lvl w:ilvl="0">
       <w:start w:val="1"/>
       <w:numFmt w:val="bullet"/>
@@ -6698,6 +7378,9 @@
   </w:num>
   <w:num w:numId="11">
     <w:abstractNumId w:val="11"/>
+  </w:num>
+  <w:num w:numId="12">
+    <w:abstractNumId w:val="12"/>
   </w:num>
 </w:numbering>
 </file>

</xml_diff>